<commit_message>
Corrige el tag del release v1.01.3 a p.1.10 en el GR03.
Co-authored-by: Cursor <cursoragent@cursor.com>
</commit_message>
<xml_diff>
--- a/docs/GR03 - GDD-1131 - Formularios Digitales APEM - v1.01.3.docx
+++ b/docs/GR03 - GDD-1131 - Formularios Digitales APEM - v1.01.3.docx
@@ -1727,7 +1727,7 @@
           <w:sz w:val="20"/>
           <w:szCs w:val="20"/>
         </w:rPr>
-        <w:t xml:space="preserve"> Formularios Digitales APEM – versión v1.01.3 (tag P_1.1.0).</w:t>
+        <w:t xml:space="preserve"> Formularios Digitales APEM – versión v1.01.3 (tag p.1.10).</w:t>
       </w:r>
     </w:p>
     <w:p>
@@ -2800,7 +2800,7 @@
           <w:sz w:val="20"/>
           <w:szCs w:val="20"/>
         </w:rPr>
-        <w:t xml:space="preserve">P_1.1.0 – Versión de la aplicación v1.01.3 (mantenimiento)</w:t>
+        <w:t xml:space="preserve">p.1.10 – Versión de la aplicación v1.01.3 (mantenimiento)</w:t>
       </w:r>
     </w:p>
     <w:p>
@@ -3536,7 +3536,7 @@
                 <w:sz w:val="20"/>
                 <w:szCs w:val="20"/>
               </w:rPr>
-              <w:t xml:space="preserve">P_1.1.0</w:t>
+              <w:t xml:space="preserve">p.1.10</w:t>
             </w:r>
           </w:p>
         </w:tc>
@@ -3839,7 +3839,7 @@
           <w:sz w:val="20"/>
           <w:szCs w:val="20"/>
         </w:rPr>
-        <w:t xml:space="preserve">Tag: P_1.1.0</w:t>
+        <w:t xml:space="preserve">Tag: p.1.10</w:t>
       </w:r>
     </w:p>
     <w:p>
@@ -3902,7 +3902,7 @@
           <w:sz w:val="20"/>
           <w:szCs w:val="20"/>
         </w:rPr>
-        <w:t xml:space="preserve">Ejecutar el pipeline apemformularios-pipeline con el tag P_1.1.0.</w:t>
+        <w:t xml:space="preserve">Ejecutar el pipeline apemformularios-pipeline con el tag p.1.10.</w:t>
       </w:r>
     </w:p>
     <w:p xmlns:wp14="http://schemas.microsoft.com/office/word/2010/wordml" wp14:textId="77777777">
@@ -4341,7 +4341,7 @@
           <w:sz w:val="20"/>
           <w:szCs w:val="20"/>
         </w:rPr>
-        <w:t xml:space="preserve"> al abrir P_1.1.0, el borrador del navegador se mueve al nuevo catálogo de APEM. Si se vuelve a P_1.0.0, esa versión no ve los APEM guardados con P_1.1.0; los datos siguen en el navegador y reaparecen al reinstalar P_1.1.0. Mitigación: exportar a PDF los formularios en curso antes de ejecutar el rollback.</w:t>
+        <w:t xml:space="preserve"> al abrir p.1.10, el borrador del navegador se mueve al nuevo catálogo de APEM. Si se vuelve a P_1.0.0, esa versión no ve los APEM guardados con p.1.10; los datos siguen en el navegador y reaparecen al reinstalar p.1.10. Mitigación: exportar a PDF los formularios en curso antes de ejecutar el rollback.</w:t>
       </w:r>
     </w:p>
     <w:p xmlns:wp14="http://schemas.microsoft.com/office/word/2010/wordml" wp14:textId="77777777">
@@ -5975,7 +5975,7 @@
                 <w:sz w:val="20"/>
                 <w:szCs w:val="20"/>
               </w:rPr>
-              <w:t xml:space="preserve">Versión inicial del documento – despliegue v1.01.3 (P_1.1.0)</w:t>
+              <w:t xml:space="preserve">Versión inicial del documento – despliegue v1.01.3 (p.1.10)</w:t>
             </w:r>
           </w:p>
         </w:tc>

</xml_diff>

<commit_message>
Incorpora la revisión del GR03 y conserva el nombre del archivo.
Co-authored-by: Cursor <cursoragent@cursor.com>
</commit_message>
<xml_diff>
--- a/docs/GR03 - GDD-1131 - Formularios Digitales APEM - v1.01.3.docx
+++ b/docs/GR03 - GDD-1131 - Formularios Digitales APEM - v1.01.3.docx
@@ -397,7 +397,7 @@
         <w:t>Explica brevemente qué se implementa, el alcance funcional/técnico y el objetivo del documento.</w:t>
       </w:r>
     </w:p>
-    <w:p>
+    <w:p xmlns:wp14="http://schemas.microsoft.com/office/word/2010/wordml" wp14:textId="77777777">
       <w:pPr>
         <w:spacing w:after="120"/>
         <w:rPr>
@@ -415,7 +415,7 @@
         <w:t xml:space="preserve">El presente documento describe la segunda implementación de modificaciones sobre los Formularios Digitales APEM (ad-oo-0136-formulario / apemformularios): una aplicación web interna para la carga, validación y exportación del formulario AD-OO-0136 en formato digital.</w:t>
       </w:r>
     </w:p>
-    <w:p>
+    <w:p xmlns:wp14="http://schemas.microsoft.com/office/word/2010/wordml" wp14:textId="77777777">
       <w:pPr>
         <w:spacing w:after="120"/>
         <w:rPr>
@@ -482,7 +482,7 @@
         <w:t>1.1 Propósito del documento</w:t>
       </w:r>
     </w:p>
-    <w:p xmlns:wp14="http://schemas.microsoft.com/office/word/2010/wordml" wp14:textId="77777777">
+    <w:p xmlns:wp14="http://schemas.microsoft.com/office/word/2010/wordml" wp14:textId="7E9C86FB">
       <w:pPr>
         <w:rPr>
           <w:rFonts w:ascii="Arial" w:hAnsi="Arial" w:cs="Arial"/>
@@ -494,7 +494,7 @@
       <w:r>
         <w:rPr>
           <w:rFonts w:ascii="Arial" w:hAnsi="Arial" w:cs="Arial"/>
-          <w:color w:val="8496B0" w:themeColor="text2" w:themeTint="99"/>
+          <w:color w:val="8496B0" w:themeColor="text2" w:themeTint="99" w:themeShade="FF"/>
           <w:sz w:val="18"/>
           <w:szCs w:val="18"/>
           <w:lang w:val="es-ES"/>
@@ -504,7 +504,7 @@
       <w:r>
         <w:rPr>
           <w:rFonts w:ascii="Arial" w:hAnsi="Arial" w:cs="Arial"/>
-          <w:color w:val="8496B0" w:themeColor="text2" w:themeTint="99"/>
+          <w:color w:val="8496B0" w:themeColor="text2" w:themeTint="99" w:themeShade="FF"/>
           <w:sz w:val="18"/>
           <w:szCs w:val="18"/>
           <w:lang w:val="es-ES"/>
@@ -514,7 +514,7 @@
       <w:r>
         <w:rPr>
           <w:rFonts w:ascii="Arial" w:hAnsi="Arial" w:cs="Arial"/>
-          <w:color w:val="8496B0" w:themeColor="text2" w:themeTint="99"/>
+          <w:color w:val="8496B0" w:themeColor="text2" w:themeTint="99" w:themeShade="FF"/>
           <w:sz w:val="18"/>
           <w:szCs w:val="18"/>
           <w:lang w:val="es-ES"/>
@@ -524,16 +524,11 @@
     </w:p>
     <w:p>
       <w:pPr>
-        <w:spacing w:after="120"/>
-        <w:rPr>
-          <w:rFonts w:ascii="Arial" w:hAnsi="Arial" w:cs="Arial"/>
-          <w:sz w:val="20"/>
-          <w:szCs w:val="20"/>
-        </w:rPr>
-      </w:pPr>
-      <w:r>
-        <w:rPr>
-          <w:rFonts w:ascii="Arial" w:hAnsi="Arial" w:cs="Arial"/>
+        <w:pStyle w:val="Normal"/>
+      </w:pPr>
+      <w:r>
+        <w:rPr>
+          <w:rFonts w:ascii="Arial" w:hAnsi="Arial" w:eastAsia="Arial" w:cs="Arial"/>
           <w:sz w:val="20"/>
           <w:szCs w:val="20"/>
         </w:rPr>
@@ -541,20 +536,21 @@
       </w:r>
       <w:r>
         <w:rPr>
-          <w:rFonts w:ascii="Arial" w:hAnsi="Arial" w:cs="Arial"/>
-          <w:b/>
-          <w:sz w:val="20"/>
-          <w:szCs w:val="20"/>
-        </w:rPr>
-        <w:t xml:space="preserve">tercer despliegue</w:t>
-      </w:r>
-      <w:r>
-        <w:rPr>
-          <w:rFonts w:ascii="Arial" w:hAnsi="Arial" w:cs="Arial"/>
-          <w:sz w:val="20"/>
-          <w:szCs w:val="20"/>
-        </w:rPr>
-        <w:t xml:space="preserve"> de la aplicación Formularios Digitales APEM (versión v1.01.3), asegurando que el acceso y funcionamiento sean correctos para los usuarios internos, sin incidencias posteriores a la publicación.</w:t>
+          <w:rFonts w:ascii="Arial" w:hAnsi="Arial" w:eastAsia="Arial" w:cs="Arial"/>
+          <w:b w:val="1"/>
+          <w:bCs w:val="1"/>
+          <w:sz w:val="20"/>
+          <w:szCs w:val="20"/>
+        </w:rPr>
+        <w:t>tercer despliegue</w:t>
+      </w:r>
+      <w:r>
+        <w:rPr>
+          <w:rFonts w:ascii="Arial" w:hAnsi="Arial" w:eastAsia="Arial" w:cs="Arial"/>
+          <w:sz w:val="20"/>
+          <w:szCs w:val="20"/>
+        </w:rPr>
+        <w:t xml:space="preserve"> de la aplicación Formularios Digitales APEM (versión p.1.1.0), asegurando que el acceso y funcionamiento sean correctos para los usuarios internos, sin incidencias posteriores a la publicación.</w:t>
       </w:r>
     </w:p>
     <w:p xmlns:wp14="http://schemas.microsoft.com/office/word/2010/wordml" wp14:textId="77777777">
@@ -717,7 +713,7 @@
             <w:tcW w:w="2785" w:type="dxa"/>
             <w:vAlign w:val="center"/>
           </w:tcPr>
-          <w:p>
+          <w:p xmlns:wp14="http://schemas.microsoft.com/office/word/2010/wordml" wp14:textId="77777777">
             <w:pPr>
               <w:spacing w:before="40" w:after="40"/>
               <w:rPr>
@@ -741,7 +737,7 @@
             <w:tcW w:w="3736" w:type="dxa"/>
             <w:vAlign w:val="center"/>
           </w:tcPr>
-          <w:p>
+          <w:p xmlns:wp14="http://schemas.microsoft.com/office/word/2010/wordml" wp14:textId="77777777">
             <w:pPr>
               <w:spacing w:before="40" w:after="40"/>
               <w:rPr>
@@ -765,7 +761,7 @@
             <w:tcW w:w="3879" w:type="dxa"/>
             <w:vAlign w:val="center"/>
           </w:tcPr>
-          <w:p>
+          <w:p xmlns:wp14="http://schemas.microsoft.com/office/word/2010/wordml" wp14:textId="77777777">
             <w:pPr>
               <w:spacing w:before="40" w:after="40"/>
               <w:rPr>
@@ -794,7 +790,7 @@
             <w:tcW w:w="2785" w:type="dxa"/>
             <w:vAlign w:val="center"/>
           </w:tcPr>
-          <w:p>
+          <w:p xmlns:wp14="http://schemas.microsoft.com/office/word/2010/wordml" wp14:textId="77777777">
             <w:pPr>
               <w:spacing w:before="40" w:after="40"/>
               <w:rPr>
@@ -818,7 +814,7 @@
             <w:tcW w:w="3736" w:type="dxa"/>
             <w:vAlign w:val="center"/>
           </w:tcPr>
-          <w:p>
+          <w:p xmlns:wp14="http://schemas.microsoft.com/office/word/2010/wordml" wp14:textId="77777777">
             <w:pPr>
               <w:spacing w:before="40" w:after="40"/>
               <w:rPr>
@@ -842,7 +838,7 @@
             <w:tcW w:w="3879" w:type="dxa"/>
             <w:vAlign w:val="center"/>
           </w:tcPr>
-          <w:p>
+          <w:p xmlns:wp14="http://schemas.microsoft.com/office/word/2010/wordml" wp14:textId="77777777">
             <w:pPr>
               <w:spacing w:before="40" w:after="40"/>
               <w:rPr>
@@ -871,7 +867,7 @@
             <w:tcW w:w="2785" w:type="dxa"/>
             <w:vAlign w:val="center"/>
           </w:tcPr>
-          <w:p>
+          <w:p xmlns:wp14="http://schemas.microsoft.com/office/word/2010/wordml" wp14:textId="77777777">
             <w:pPr>
               <w:spacing w:before="40" w:after="40"/>
               <w:rPr>
@@ -895,7 +891,7 @@
             <w:tcW w:w="3736" w:type="dxa"/>
             <w:vAlign w:val="center"/>
           </w:tcPr>
-          <w:p>
+          <w:p xmlns:wp14="http://schemas.microsoft.com/office/word/2010/wordml" wp14:textId="77777777">
             <w:pPr>
               <w:spacing w:before="40" w:after="40"/>
               <w:rPr>
@@ -919,7 +915,7 @@
             <w:tcW w:w="3879" w:type="dxa"/>
             <w:vAlign w:val="center"/>
           </w:tcPr>
-          <w:p>
+          <w:p xmlns:wp14="http://schemas.microsoft.com/office/word/2010/wordml" wp14:textId="77777777">
             <w:pPr>
               <w:spacing w:before="40" w:after="40"/>
               <w:rPr>
@@ -948,7 +944,7 @@
             <w:tcW w:w="2785" w:type="dxa"/>
             <w:vAlign w:val="center"/>
           </w:tcPr>
-          <w:p>
+          <w:p xmlns:wp14="http://schemas.microsoft.com/office/word/2010/wordml" wp14:textId="77777777">
             <w:pPr>
               <w:spacing w:before="40" w:after="40"/>
               <w:rPr>
@@ -972,7 +968,7 @@
             <w:tcW w:w="3736" w:type="dxa"/>
             <w:vAlign w:val="center"/>
           </w:tcPr>
-          <w:p>
+          <w:p xmlns:wp14="http://schemas.microsoft.com/office/word/2010/wordml" wp14:textId="77777777">
             <w:pPr>
               <w:spacing w:before="40" w:after="40"/>
               <w:rPr>
@@ -996,7 +992,7 @@
             <w:tcW w:w="3879" w:type="dxa"/>
             <w:vAlign w:val="center"/>
           </w:tcPr>
-          <w:p>
+          <w:p xmlns:wp14="http://schemas.microsoft.com/office/word/2010/wordml" wp14:textId="77777777">
             <w:pPr>
               <w:spacing w:before="40" w:after="40"/>
               <w:rPr>
@@ -1098,6 +1094,7 @@
           <w:tcPr>
             <w:tcW w:w="2728" w:type="dxa"/>
             <w:shd w:val="clear" w:color="auto" w:fill="D9E2F3" w:themeFill="accent1" w:themeFillTint="33"/>
+            <w:tcMar/>
             <w:vAlign w:val="center"/>
           </w:tcPr>
           <w:p wp14:textId="77777777">
@@ -1121,6 +1118,7 @@
           <w:tcPr>
             <w:tcW w:w="1622" w:type="dxa"/>
             <w:shd w:val="clear" w:color="auto" w:fill="D9E2F3" w:themeFill="accent1" w:themeFillTint="33"/>
+            <w:tcMar/>
             <w:vAlign w:val="center"/>
           </w:tcPr>
           <w:p wp14:textId="77777777">
@@ -1144,6 +1142,7 @@
           <w:tcPr>
             <w:tcW w:w="2212" w:type="dxa"/>
             <w:shd w:val="clear" w:color="auto" w:fill="D9E2F3" w:themeFill="accent1" w:themeFillTint="33"/>
+            <w:tcMar/>
             <w:vAlign w:val="center"/>
           </w:tcPr>
           <w:p wp14:textId="77777777">
@@ -1167,6 +1166,7 @@
           <w:tcPr>
             <w:tcW w:w="3835" w:type="dxa"/>
             <w:shd w:val="clear" w:color="auto" w:fill="D9E2F3" w:themeFill="accent1" w:themeFillTint="33"/>
+            <w:tcMar/>
             <w:vAlign w:val="center"/>
           </w:tcPr>
           <w:p wp14:textId="77777777">
@@ -1194,9 +1194,10 @@
         <w:tc>
           <w:tcPr>
             <w:tcW w:w="2728" w:type="dxa"/>
+            <w:tcMar/>
             <w:vAlign w:val="center"/>
           </w:tcPr>
-          <w:p>
+          <w:p xmlns:wp14="http://schemas.microsoft.com/office/word/2010/wordml" wp14:textId="77777777">
             <w:pPr>
               <w:spacing w:before="40" w:after="40"/>
               <w:rPr>
@@ -1218,9 +1219,10 @@
         <w:tc>
           <w:tcPr>
             <w:tcW w:w="1622" w:type="dxa"/>
+            <w:tcMar/>
             <w:vAlign w:val="center"/>
           </w:tcPr>
-          <w:p>
+          <w:p xmlns:wp14="http://schemas.microsoft.com/office/word/2010/wordml" wp14:textId="77777777">
             <w:pPr>
               <w:spacing w:before="40" w:after="40"/>
               <w:rPr>
@@ -1242,9 +1244,10 @@
         <w:tc>
           <w:tcPr>
             <w:tcW w:w="2212" w:type="dxa"/>
+            <w:tcMar/>
             <w:vAlign w:val="center"/>
           </w:tcPr>
-          <w:p>
+          <w:p xmlns:wp14="http://schemas.microsoft.com/office/word/2010/wordml" wp14:textId="77777777">
             <w:pPr>
               <w:spacing w:before="40" w:after="40"/>
               <w:rPr>
@@ -1266,9 +1269,10 @@
         <w:tc>
           <w:tcPr>
             <w:tcW w:w="3835" w:type="dxa"/>
+            <w:tcMar/>
             <w:vAlign w:val="center"/>
           </w:tcPr>
-          <w:p>
+          <w:p xmlns:wp14="http://schemas.microsoft.com/office/word/2010/wordml" wp14:textId="77777777">
             <w:pPr>
               <w:spacing w:before="40" w:after="40"/>
               <w:rPr>
@@ -1295,9 +1299,10 @@
         <w:tc>
           <w:tcPr>
             <w:tcW w:w="2728" w:type="dxa"/>
+            <w:tcMar/>
             <w:vAlign w:val="center"/>
           </w:tcPr>
-          <w:p>
+          <w:p xmlns:wp14="http://schemas.microsoft.com/office/word/2010/wordml" wp14:textId="77777777">
             <w:pPr>
               <w:spacing w:before="40" w:after="40"/>
               <w:rPr>
@@ -1319,9 +1324,10 @@
         <w:tc>
           <w:tcPr>
             <w:tcW w:w="1622" w:type="dxa"/>
+            <w:tcMar/>
             <w:vAlign w:val="center"/>
           </w:tcPr>
-          <w:p>
+          <w:p xmlns:wp14="http://schemas.microsoft.com/office/word/2010/wordml" wp14:textId="77777777">
             <w:pPr>
               <w:spacing w:before="40" w:after="40"/>
               <w:rPr>
@@ -1343,9 +1349,10 @@
         <w:tc>
           <w:tcPr>
             <w:tcW w:w="2212" w:type="dxa"/>
+            <w:tcMar/>
             <w:vAlign w:val="center"/>
           </w:tcPr>
-          <w:p>
+          <w:p xmlns:wp14="http://schemas.microsoft.com/office/word/2010/wordml" wp14:textId="77777777">
             <w:pPr>
               <w:spacing w:before="40" w:after="40"/>
               <w:rPr>
@@ -1367,9 +1374,10 @@
         <w:tc>
           <w:tcPr>
             <w:tcW w:w="3835" w:type="dxa"/>
+            <w:tcMar/>
             <w:vAlign w:val="center"/>
           </w:tcPr>
-          <w:p>
+          <w:p xmlns:wp14="http://schemas.microsoft.com/office/word/2010/wordml" wp14:textId="77777777">
             <w:pPr>
               <w:spacing w:before="40" w:after="40"/>
               <w:rPr>
@@ -1396,9 +1404,10 @@
         <w:tc>
           <w:tcPr>
             <w:tcW w:w="2728" w:type="dxa"/>
+            <w:tcMar/>
             <w:vAlign w:val="center"/>
           </w:tcPr>
-          <w:p>
+          <w:p xmlns:wp14="http://schemas.microsoft.com/office/word/2010/wordml" wp14:textId="77777777">
             <w:pPr>
               <w:spacing w:before="40" w:after="40"/>
               <w:rPr>
@@ -1420,9 +1429,10 @@
         <w:tc>
           <w:tcPr>
             <w:tcW w:w="1622" w:type="dxa"/>
+            <w:tcMar/>
             <w:vAlign w:val="center"/>
           </w:tcPr>
-          <w:p>
+          <w:p xmlns:wp14="http://schemas.microsoft.com/office/word/2010/wordml" wp14:textId="77777777">
             <w:pPr>
               <w:spacing w:before="40" w:after="40"/>
               <w:rPr>
@@ -1444,9 +1454,10 @@
         <w:tc>
           <w:tcPr>
             <w:tcW w:w="2212" w:type="dxa"/>
+            <w:tcMar/>
             <w:vAlign w:val="center"/>
           </w:tcPr>
-          <w:p>
+          <w:p xmlns:wp14="http://schemas.microsoft.com/office/word/2010/wordml" wp14:textId="77777777">
             <w:pPr>
               <w:spacing w:before="40" w:after="40"/>
               <w:rPr>
@@ -1468,24 +1479,20 @@
         <w:tc>
           <w:tcPr>
             <w:tcW w:w="3835" w:type="dxa"/>
+            <w:tcMar/>
             <w:vAlign w:val="center"/>
           </w:tcPr>
           <w:p>
             <w:pPr>
-              <w:spacing w:before="40" w:after="40"/>
-              <w:rPr>
-                <w:rFonts w:ascii="Arial" w:hAnsi="Arial" w:cs="Arial"/>
-                <w:sz w:val="20"/>
-                <w:szCs w:val="20"/>
-              </w:rPr>
+              <w:pStyle w:val="Normal"/>
             </w:pPr>
             <w:r>
               <w:rPr>
-                <w:rFonts w:ascii="Arial" w:hAnsi="Arial" w:cs="Arial"/>
-                <w:sz w:val="20"/>
-                <w:szCs w:val="20"/>
-              </w:rPr>
-              <w:t xml:space="preserve">GR03 correspondiente al segundo despliegue (logger, tag P_1.0.0)</w:t>
+                <w:rFonts w:ascii="Arial" w:hAnsi="Arial" w:eastAsia="Arial" w:cs="Arial"/>
+                <w:sz w:val="20"/>
+                <w:szCs w:val="20"/>
+              </w:rPr>
+              <w:t>GR03 correspondiente al segundo despliegue (logger, tag p.1.0.0)</w:t>
             </w:r>
           </w:p>
         </w:tc>
@@ -1497,9 +1504,10 @@
         <w:tc>
           <w:tcPr>
             <w:tcW w:w="2728" w:type="dxa"/>
+            <w:tcMar/>
             <w:vAlign w:val="center"/>
           </w:tcPr>
-          <w:p>
+          <w:p xmlns:wp14="http://schemas.microsoft.com/office/word/2010/wordml" wp14:textId="77777777">
             <w:pPr>
               <w:spacing w:before="40" w:after="40"/>
               <w:rPr>
@@ -1521,33 +1529,30 @@
         <w:tc>
           <w:tcPr>
             <w:tcW w:w="1622" w:type="dxa"/>
+            <w:tcMar/>
             <w:vAlign w:val="center"/>
           </w:tcPr>
           <w:p>
             <w:pPr>
-              <w:spacing w:before="40" w:after="40"/>
-              <w:rPr>
-                <w:rFonts w:ascii="Arial" w:hAnsi="Arial" w:cs="Arial"/>
-                <w:sz w:val="20"/>
-                <w:szCs w:val="20"/>
-              </w:rPr>
+              <w:pStyle w:val="Normal"/>
             </w:pPr>
             <w:r>
               <w:rPr>
-                <w:rFonts w:ascii="Arial" w:hAnsi="Arial" w:cs="Arial"/>
-                <w:sz w:val="20"/>
-                <w:szCs w:val="20"/>
-              </w:rPr>
-              <w:t xml:space="preserve">v1.01.3</w:t>
+                <w:rFonts w:ascii="Arial" w:hAnsi="Arial" w:eastAsia="Arial" w:cs="Arial"/>
+                <w:sz w:val="20"/>
+                <w:szCs w:val="20"/>
+              </w:rPr>
+              <w:t>p.1.1.0</w:t>
             </w:r>
           </w:p>
         </w:tc>
         <w:tc>
           <w:tcPr>
             <w:tcW w:w="2212" w:type="dxa"/>
+            <w:tcMar/>
             <w:vAlign w:val="center"/>
           </w:tcPr>
-          <w:p>
+          <w:p xmlns:wp14="http://schemas.microsoft.com/office/word/2010/wordml" wp14:textId="77777777">
             <w:pPr>
               <w:spacing w:before="40" w:after="40"/>
               <w:rPr>
@@ -1569,9 +1574,10 @@
         <w:tc>
           <w:tcPr>
             <w:tcW w:w="3835" w:type="dxa"/>
+            <w:tcMar/>
             <w:vAlign w:val="center"/>
           </w:tcPr>
-          <w:p>
+          <w:p xmlns:wp14="http://schemas.microsoft.com/office/word/2010/wordml" wp14:textId="77777777">
             <w:pPr>
               <w:spacing w:before="40" w:after="40"/>
               <w:rPr>
@@ -1680,7 +1686,7 @@
         <w:t>Información del release</w:t>
       </w:r>
     </w:p>
-    <w:p xmlns:wp14="http://schemas.microsoft.com/office/word/2010/wordml" wp14:textId="77777777">
+    <w:p xmlns:wp14="http://schemas.microsoft.com/office/word/2010/wordml" wp14:textId="56AF30B0">
       <w:pPr>
         <w:shd w:val="clear" w:color="auto" w:fill="FFFFFF" w:themeFill="background1"/>
         <w:textAlignment w:val="baseline"/>
@@ -1695,7 +1701,7 @@
       <w:r>
         <w:rPr>
           <w:rFonts w:ascii="Arial" w:hAnsi="Arial" w:cs="Arial"/>
-          <w:color w:val="8496B0" w:themeColor="text2" w:themeTint="99"/>
+          <w:color w:val="8496B0" w:themeColor="text2" w:themeTint="99" w:themeShade="FF"/>
           <w:sz w:val="18"/>
           <w:szCs w:val="18"/>
           <w:lang w:val="es-ES"/>
@@ -1705,6 +1711,39 @@
     </w:p>
     <w:p>
       <w:pPr>
+        <w:pStyle w:val="Normal"/>
+      </w:pPr>
+      <w:r>
+        <w:rPr>
+          <w:rFonts w:ascii="Arial" w:hAnsi="Arial" w:eastAsia="Arial" w:cs="Arial"/>
+          <w:b w:val="1"/>
+          <w:bCs w:val="1"/>
+          <w:sz w:val="20"/>
+          <w:szCs w:val="20"/>
+        </w:rPr>
+        <w:t>Release</w:t>
+      </w:r>
+      <w:r>
+        <w:rPr>
+          <w:rFonts w:ascii="Arial" w:hAnsi="Arial" w:eastAsia="Arial" w:cs="Arial"/>
+          <w:b w:val="1"/>
+          <w:bCs w:val="1"/>
+          <w:sz w:val="20"/>
+          <w:szCs w:val="20"/>
+        </w:rPr>
+        <w:t>:</w:t>
+      </w:r>
+      <w:r>
+        <w:rPr>
+          <w:rFonts w:ascii="Arial" w:hAnsi="Arial" w:eastAsia="Arial" w:cs="Arial"/>
+          <w:sz w:val="20"/>
+          <w:szCs w:val="20"/>
+        </w:rPr>
+        <w:t xml:space="preserve"> Formularios Digitales APEM – versión p.1.1.0 </w:t>
+      </w:r>
+    </w:p>
+    <w:p xmlns:wp14="http://schemas.microsoft.com/office/word/2010/wordml" wp14:textId="77777777">
+      <w:pPr>
         <w:spacing w:after="120"/>
         <w:rPr>
           <w:rFonts w:ascii="Arial" w:hAnsi="Arial" w:cs="Arial"/>
@@ -1719,18 +1758,18 @@
           <w:sz w:val="20"/>
           <w:szCs w:val="20"/>
         </w:rPr>
-        <w:t xml:space="preserve">Release:</w:t>
-      </w:r>
-      <w:r>
-        <w:rPr>
-          <w:rFonts w:ascii="Arial" w:hAnsi="Arial" w:cs="Arial"/>
-          <w:sz w:val="20"/>
-          <w:szCs w:val="20"/>
-        </w:rPr>
-        <w:t xml:space="preserve"> Formularios Digitales APEM – versión v1.01.3 (tag p.1.10).</w:t>
-      </w:r>
-    </w:p>
-    <w:p>
+        <w:t xml:space="preserve">Módulos afectados:</w:t>
+      </w:r>
+      <w:r>
+        <w:rPr>
+          <w:rFonts w:ascii="Arial" w:hAnsi="Arial" w:cs="Arial"/>
+          <w:sz w:val="20"/>
+          <w:szCs w:val="20"/>
+        </w:rPr>
+        <w:t xml:space="preserve"> carátula, gestión de borradores (localStorage), generación del PDF imprimible y envío del formulario.</w:t>
+      </w:r>
+    </w:p>
+    <w:p xmlns:wp14="http://schemas.microsoft.com/office/word/2010/wordml" wp14:textId="16B61F5D">
       <w:pPr>
         <w:spacing w:after="120"/>
         <w:rPr>
@@ -1742,46 +1781,20 @@
       <w:r>
         <w:rPr>
           <w:rFonts w:ascii="Arial" w:hAnsi="Arial" w:cs="Arial"/>
-          <w:b/>
-          <w:sz w:val="20"/>
-          <w:szCs w:val="20"/>
-        </w:rPr>
-        <w:t xml:space="preserve">Módulos afectados:</w:t>
-      </w:r>
-      <w:r>
-        <w:rPr>
-          <w:rFonts w:ascii="Arial" w:hAnsi="Arial" w:cs="Arial"/>
-          <w:sz w:val="20"/>
-          <w:szCs w:val="20"/>
-        </w:rPr>
-        <w:t xml:space="preserve"> carátula, gestión de borradores (localStorage), generación del PDF imprimible y envío del formulario.</w:t>
-      </w:r>
-    </w:p>
-    <w:p>
-      <w:pPr>
-        <w:spacing w:after="120"/>
-        <w:rPr>
-          <w:rFonts w:ascii="Arial" w:hAnsi="Arial" w:cs="Arial"/>
-          <w:sz w:val="20"/>
-          <w:szCs w:val="20"/>
-        </w:rPr>
-      </w:pPr>
-      <w:r>
-        <w:rPr>
-          <w:rFonts w:ascii="Arial" w:hAnsi="Arial" w:cs="Arial"/>
-          <w:b/>
-          <w:sz w:val="20"/>
-          <w:szCs w:val="20"/>
-        </w:rPr>
-        <w:t xml:space="preserve">Tipo de cambio:</w:t>
-      </w:r>
-      <w:r>
-        <w:rPr>
-          <w:rFonts w:ascii="Arial" w:hAnsi="Arial" w:cs="Arial"/>
-          <w:sz w:val="20"/>
-          <w:szCs w:val="20"/>
-        </w:rPr>
-        <w:t xml:space="preserve"> mantenimiento (nueva funcionalidad y correcciones). Riesgo bajo: sin cambios de infraestructura; Dockerfile, nginx y manifiestos de OpenShift son los mismos del despliegue anterior.</w:t>
+          <w:b w:val="1"/>
+          <w:bCs w:val="1"/>
+          <w:sz w:val="20"/>
+          <w:szCs w:val="20"/>
+        </w:rPr>
+        <w:t>Tipo de cambio:</w:t>
+      </w:r>
+      <w:r>
+        <w:rPr>
+          <w:rFonts w:ascii="Arial" w:hAnsi="Arial" w:cs="Arial"/>
+          <w:sz w:val="20"/>
+          <w:szCs w:val="20"/>
+        </w:rPr>
+        <w:t xml:space="preserve"> mantenimiento (nueva funcionalidad y correcciones). Riesgo bajo: sin cambios de infraestructura.</w:t>
       </w:r>
     </w:p>
     <w:p xmlns:wp14="http://schemas.microsoft.com/office/word/2010/wordml" wp14:textId="77777777">
@@ -2044,7 +2057,7 @@
         <w:t>deploy.</w:t>
       </w:r>
     </w:p>
-    <w:p>
+    <w:p xmlns:wp14="http://schemas.microsoft.com/office/word/2010/wordml" wp14:textId="77777777">
       <w:pPr>
         <w:spacing w:after="120"/>
         <w:rPr>
@@ -2062,7 +2075,7 @@
         <w:t xml:space="preserve">La implementación contempla la modificación de la aplicación de formularios digitales APEM, donde se realizaron:</w:t>
       </w:r>
     </w:p>
-    <w:p>
+    <w:p xmlns:wp14="http://schemas.microsoft.com/office/word/2010/wordml" wp14:textId="4D4BE28E">
       <w:pPr>
         <w:numPr>
           <w:ilvl w:val="0"/>
@@ -2078,11 +2091,12 @@
       <w:r>
         <w:rPr>
           <w:rFonts w:ascii="Arial" w:hAnsi="Arial" w:cs="Arial"/>
-          <w:b/>
-          <w:sz w:val="20"/>
-          <w:szCs w:val="20"/>
-        </w:rPr>
-        <w:t xml:space="preserve">Varios APEM en el navegador:</w:t>
+          <w:b w:val="1"/>
+          <w:bCs w:val="1"/>
+          <w:sz w:val="20"/>
+          <w:szCs w:val="20"/>
+        </w:rPr>
+        <w:t>Permite guardado de varios APEM en el navegador:</w:t>
       </w:r>
       <w:r>
         <w:rPr>
@@ -2093,7 +2107,7 @@
         <w:t xml:space="preserve"> nuevo menú APEM para crear, abrir y alternar entre varios formularios guardados localmente. El borrador de la versión anterior se importa automáticamente la primera vez.</w:t>
       </w:r>
     </w:p>
-    <w:p>
+    <w:p xmlns:wp14="http://schemas.microsoft.com/office/word/2010/wordml" wp14:textId="77777777">
       <w:pPr>
         <w:numPr>
           <w:ilvl w:val="0"/>
@@ -2124,7 +2138,7 @@
         <w:t xml:space="preserve"> selector de área ajustado al organigrama vigente y validación de los campos obligatorios para el PDF.</w:t>
       </w:r>
     </w:p>
-    <w:p>
+    <w:p xmlns:wp14="http://schemas.microsoft.com/office/word/2010/wordml" wp14:textId="34541854">
       <w:pPr>
         <w:numPr>
           <w:ilvl w:val="0"/>
@@ -2140,22 +2154,39 @@
       <w:r>
         <w:rPr>
           <w:rFonts w:ascii="Arial" w:hAnsi="Arial" w:cs="Arial"/>
-          <w:b/>
-          <w:sz w:val="20"/>
-          <w:szCs w:val="20"/>
-        </w:rPr>
-        <w:t xml:space="preserve">Botón “Enviar formulario”:</w:t>
-      </w:r>
-      <w:r>
-        <w:rPr>
-          <w:rFonts w:ascii="Arial" w:hAnsi="Arial" w:cs="Arial"/>
-          <w:sz w:val="20"/>
-          <w:szCs w:val="20"/>
-        </w:rPr>
-        <w:t xml:space="preserve"> genera un borrador de correo (.eml) con el PDF adjunto, dirigido a las casillas de APEM (MABruno@correoargentino.com.ar y dersinger@correoargentino.com.ar). Outlook lo abre y el usuario lo envía desde su cuenta; la aplicación no envía correos desde el servidor.</w:t>
-      </w:r>
-    </w:p>
-    <w:p>
+          <w:b w:val="1"/>
+          <w:bCs w:val="1"/>
+          <w:sz w:val="20"/>
+          <w:szCs w:val="20"/>
+        </w:rPr>
+        <w:t>Botón “Enviar formulario”:</w:t>
+      </w:r>
+      <w:r>
+        <w:rPr>
+          <w:rFonts w:ascii="Arial" w:hAnsi="Arial" w:cs="Arial"/>
+          <w:sz w:val="20"/>
+          <w:szCs w:val="20"/>
+        </w:rPr>
+        <w:t xml:space="preserve"> genera un borrador de correo (.</w:t>
+      </w:r>
+      <w:r>
+        <w:rPr>
+          <w:rFonts w:ascii="Arial" w:hAnsi="Arial" w:cs="Arial"/>
+          <w:sz w:val="20"/>
+          <w:szCs w:val="20"/>
+        </w:rPr>
+        <w:t>eml</w:t>
+      </w:r>
+      <w:r>
+        <w:rPr>
+          <w:rFonts w:ascii="Arial" w:hAnsi="Arial" w:cs="Arial"/>
+          <w:sz w:val="20"/>
+          <w:szCs w:val="20"/>
+        </w:rPr>
+        <w:t>) con el PDF adjunto, dirigido a las casillas de (MABruno@correoargentino.com.ar y dersinger@correoargentino.com.ar). Outlook lo abre y el usuario lo envía desde su cuenta; la aplicación no envía correos desde el servidor.</w:t>
+      </w:r>
+    </w:p>
+    <w:p xmlns:wp14="http://schemas.microsoft.com/office/word/2010/wordml" wp14:textId="77777777">
       <w:pPr>
         <w:numPr>
           <w:ilvl w:val="0"/>
@@ -2202,11 +2233,12 @@
       <w:r>
         <w:rPr>
           <w:rFonts w:ascii="Arial" w:hAnsi="Arial" w:cs="Arial"/>
-          <w:b/>
-          <w:sz w:val="20"/>
-          <w:szCs w:val="20"/>
-        </w:rPr>
-        <w:t xml:space="preserve">Montos e indicadores:</w:t>
+          <w:b w:val="1"/>
+          <w:bCs w:val="1"/>
+          <w:sz w:val="20"/>
+          <w:szCs w:val="20"/>
+        </w:rPr>
+        <w:t>Montos e indicadores:</w:t>
       </w:r>
       <w:r>
         <w:rPr>
@@ -2219,64 +2251,30 @@
     </w:p>
     <w:p>
       <w:pPr>
+        <w:pStyle w:val="Prrafodelista"/>
         <w:numPr>
           <w:ilvl w:val="0"/>
           <w:numId w:val="900"/>
         </w:numPr>
-        <w:spacing w:after="60"/>
-        <w:rPr>
-          <w:rFonts w:ascii="Arial" w:hAnsi="Arial" w:cs="Arial"/>
-          <w:sz w:val="20"/>
-          <w:szCs w:val="20"/>
-        </w:rPr>
-      </w:pPr>
-      <w:r>
-        <w:rPr>
-          <w:rFonts w:ascii="Arial" w:hAnsi="Arial" w:cs="Arial"/>
-          <w:b/>
-          <w:sz w:val="20"/>
-          <w:szCs w:val="20"/>
-        </w:rPr>
-        <w:t xml:space="preserve">Código del formulario:</w:t>
-      </w:r>
-      <w:r>
-        <w:rPr>
-          <w:rFonts w:ascii="Arial" w:hAnsi="Arial" w:cs="Arial"/>
-          <w:sz w:val="20"/>
-          <w:szCs w:val="20"/>
-        </w:rPr>
-        <w:t xml:space="preserve"> el PDF muestra AD-OO-0136/01, sin revisión ni mes.</w:t>
-      </w:r>
-    </w:p>
-    <w:p>
-      <w:pPr>
-        <w:numPr>
-          <w:ilvl w:val="0"/>
-          <w:numId w:val="900"/>
-        </w:numPr>
-        <w:spacing w:after="60"/>
-        <w:rPr>
-          <w:rFonts w:ascii="Arial" w:hAnsi="Arial" w:cs="Arial"/>
-          <w:sz w:val="20"/>
-          <w:szCs w:val="20"/>
-        </w:rPr>
-      </w:pPr>
-      <w:r>
-        <w:rPr>
-          <w:rFonts w:ascii="Arial" w:hAnsi="Arial" w:cs="Arial"/>
-          <w:b/>
-          <w:sz w:val="20"/>
-          <w:szCs w:val="20"/>
-        </w:rPr>
-        <w:t xml:space="preserve">Versión de la aplicación:</w:t>
-      </w:r>
-      <w:r>
-        <w:rPr>
-          <w:rFonts w:ascii="Arial" w:hAnsi="Arial" w:cs="Arial"/>
-          <w:sz w:val="20"/>
-          <w:szCs w:val="20"/>
-        </w:rPr>
-        <w:t xml:space="preserve"> v1.01.3, visible en el pie de página.</w:t>
+        <w:rPr/>
+      </w:pPr>
+      <w:r>
+        <w:rPr>
+          <w:rFonts w:ascii="Arial" w:hAnsi="Arial" w:eastAsia="Arial" w:cs="Arial"/>
+          <w:b w:val="1"/>
+          <w:bCs w:val="1"/>
+          <w:sz w:val="20"/>
+          <w:szCs w:val="20"/>
+        </w:rPr>
+        <w:t>Versión de la aplicación:</w:t>
+      </w:r>
+      <w:r>
+        <w:rPr>
+          <w:rFonts w:ascii="Arial" w:hAnsi="Arial" w:eastAsia="Arial" w:cs="Arial"/>
+          <w:sz w:val="20"/>
+          <w:szCs w:val="20"/>
+        </w:rPr>
+        <w:t xml:space="preserve"> p.1.1.0, visible en el pie de página.</w:t>
       </w:r>
     </w:p>
     <w:p xmlns:wp14="http://schemas.microsoft.com/office/word/2010/wordml" wp14:textId="77777777">
@@ -2399,31 +2397,28 @@
         <w:tc>
           <w:tcPr>
             <w:tcW w:w="813" w:type="dxa"/>
+            <w:tcMar/>
             <w:vAlign w:val="center"/>
           </w:tcPr>
-          <w:p wp14:textId="77777777">
+          <w:p wp14:textId="6B82EAAF">
             <w:pPr>
               <w:jc w:val="center"/>
               <w:rPr>
-                <w:sz w:val="34"/>
-                <w:szCs w:val="34"/>
-                <w:lang w:val="es-ES"/>
-              </w:rPr>
-            </w:pPr>
-            <w:r>
-              <w:rPr>
-                <w:rFonts w:ascii="Agency FB" w:hAnsi="Agency FB" w:cstheme="minorHAnsi"/>
-                <w:b/>
+                <w:rFonts w:ascii="Agency FB" w:hAnsi="Agency FB" w:cs="Calibri" w:cstheme="minorAscii"/>
+                <w:b w:val="1"/>
+                <w:bCs w:val="1"/>
                 <w:color w:val="FF0000"/>
                 <w:sz w:val="28"/>
-              </w:rPr>
-              <w:t>X</w:t>
-            </w:r>
+                <w:szCs w:val="28"/>
+                <w:lang w:val="es-ES"/>
+              </w:rPr>
+            </w:pPr>
           </w:p>
         </w:tc>
         <w:tc>
           <w:tcPr>
             <w:tcW w:w="9641" w:type="dxa"/>
+            <w:tcMar/>
             <w:vAlign w:val="center"/>
           </w:tcPr>
           <w:p wp14:textId="77777777">
@@ -2450,6 +2445,7 @@
         <w:tc>
           <w:tcPr>
             <w:tcW w:w="813" w:type="dxa"/>
+            <w:tcMar/>
             <w:vAlign w:val="center"/>
           </w:tcPr>
           <w:p wp14:textId="77777777">
@@ -2474,6 +2470,7 @@
         <w:tc>
           <w:tcPr>
             <w:tcW w:w="9641" w:type="dxa"/>
+            <w:tcMar/>
             <w:vAlign w:val="center"/>
           </w:tcPr>
           <w:p wp14:textId="77777777">
@@ -2497,26 +2494,27 @@
         <w:tc>
           <w:tcPr>
             <w:tcW w:w="813" w:type="dxa"/>
+            <w:tcMar/>
             <w:vAlign w:val="center"/>
           </w:tcPr>
-          <w:p wp14:textId="77777777">
+          <w:p wp14:textId="7B8AA0B3">
             <w:pPr>
               <w:jc w:val="center"/>
-            </w:pPr>
-            <w:r>
-              <w:rPr>
-                <w:rFonts w:ascii="Agency FB" w:hAnsi="Agency FB" w:cstheme="minorHAnsi"/>
-                <w:b/>
+              <w:rPr>
+                <w:rFonts w:ascii="Agency FB" w:hAnsi="Agency FB" w:cs="Calibri" w:cstheme="minorAscii"/>
+                <w:b w:val="1"/>
+                <w:bCs w:val="1"/>
                 <w:color w:val="FF0000"/>
                 <w:sz w:val="28"/>
-              </w:rPr>
-              <w:t>X</w:t>
-            </w:r>
+                <w:szCs w:val="28"/>
+              </w:rPr>
+            </w:pPr>
           </w:p>
         </w:tc>
         <w:tc>
           <w:tcPr>
             <w:tcW w:w="9641" w:type="dxa"/>
+            <w:tcMar/>
             <w:vAlign w:val="center"/>
           </w:tcPr>
           <w:p wp14:textId="77777777">
@@ -2540,26 +2538,27 @@
         <w:tc>
           <w:tcPr>
             <w:tcW w:w="813" w:type="dxa"/>
+            <w:tcMar/>
             <w:vAlign w:val="center"/>
           </w:tcPr>
-          <w:p wp14:textId="77777777">
+          <w:p wp14:textId="64AB228B">
             <w:pPr>
               <w:jc w:val="center"/>
-            </w:pPr>
-            <w:r>
-              <w:rPr>
-                <w:rFonts w:ascii="Agency FB" w:hAnsi="Agency FB" w:cstheme="minorHAnsi"/>
-                <w:b/>
+              <w:rPr>
+                <w:rFonts w:ascii="Agency FB" w:hAnsi="Agency FB" w:cs="Calibri" w:cstheme="minorAscii"/>
+                <w:b w:val="1"/>
+                <w:bCs w:val="1"/>
                 <w:color w:val="FF0000"/>
                 <w:sz w:val="28"/>
-              </w:rPr>
-              <w:t>X</w:t>
-            </w:r>
+                <w:szCs w:val="28"/>
+              </w:rPr>
+            </w:pPr>
           </w:p>
         </w:tc>
         <w:tc>
           <w:tcPr>
             <w:tcW w:w="9641" w:type="dxa"/>
+            <w:tcMar/>
             <w:vAlign w:val="center"/>
           </w:tcPr>
           <w:p wp14:textId="77777777">
@@ -2627,7 +2626,7 @@
         <w:t>Listado de funcionalidad incluida en el reléase</w:t>
       </w:r>
     </w:p>
-    <w:p>
+    <w:p xmlns:wp14="http://schemas.microsoft.com/office/word/2010/wordml" wp14:textId="77777777">
       <w:pPr>
         <w:numPr>
           <w:ilvl w:val="0"/>
@@ -2649,7 +2648,7 @@
         <w:t xml:space="preserve">Gestión de varios APEM guardados en el navegador (menú APEM)</w:t>
       </w:r>
     </w:p>
-    <w:p>
+    <w:p xmlns:wp14="http://schemas.microsoft.com/office/word/2010/wordml" wp14:textId="77777777">
       <w:pPr>
         <w:numPr>
           <w:ilvl w:val="0"/>
@@ -2671,7 +2670,33 @@
         <w:t xml:space="preserve">Envío del formulario a las casillas de APEM (borrador .eml con PDF adjunto)</w:t>
       </w:r>
     </w:p>
-    <w:p>
+    <w:p xmlns:wp14="http://schemas.microsoft.com/office/word/2010/wordml" wp14:textId="21001894">
+      <w:pPr>
+        <w:pStyle w:val="Normal"/>
+        <w:spacing w:after="60"/>
+        <w:ind w:left="0"/>
+        <w:rPr>
+          <w:rFonts w:ascii="Arial" w:hAnsi="Arial" w:cs="Arial"/>
+          <w:sz w:val="20"/>
+          <w:szCs w:val="20"/>
+        </w:rPr>
+      </w:pPr>
+    </w:p>
+    <w:p xmlns:wp14="http://schemas.microsoft.com/office/word/2010/wordml" wp14:textId="77777777">
+      <w:pPr>
+        <w:ind w:left="426"/>
+        <w:rPr>
+          <w:rFonts w:ascii="Arial" w:hAnsi="Arial" w:cs="Arial"/>
+        </w:rPr>
+      </w:pPr>
+      <w:r>
+        <w:rPr>
+          <w:rFonts w:ascii="Arial" w:hAnsi="Arial" w:cs="Arial"/>
+        </w:rPr>
+        <w:t>2.2.3 Problemas conocidos</w:t>
+      </w:r>
+    </w:p>
+    <w:p xmlns:wp14="http://schemas.microsoft.com/office/word/2010/wordml" wp14:textId="77777777">
       <w:pPr>
         <w:numPr>
           <w:ilvl w:val="0"/>
@@ -2690,10 +2715,198 @@
           <w:sz w:val="20"/>
           <w:szCs w:val="20"/>
         </w:rPr>
-        <w:t xml:space="preserve">Sección unificada Observaciones y Comentarios</w:t>
+        <w:t xml:space="preserve">S/R</w:t>
+      </w:r>
+    </w:p>
+    <w:p xmlns:wp14="http://schemas.microsoft.com/office/word/2010/wordml" wp14:textId="77777777">
+      <w:pPr>
+        <w:ind w:left="426"/>
+        <w:rPr>
+          <w:rFonts w:ascii="Arial" w:hAnsi="Arial" w:cs="Arial"/>
+        </w:rPr>
+      </w:pPr>
+    </w:p>
+    <w:p xmlns:wp14="http://schemas.microsoft.com/office/word/2010/wordml" wp14:textId="77777777">
+      <w:pPr>
+        <w:ind w:left="426"/>
+        <w:rPr>
+          <w:rFonts w:ascii="Arial" w:hAnsi="Arial" w:cs="Arial"/>
+        </w:rPr>
+      </w:pPr>
+      <w:r>
+        <w:rPr>
+          <w:rFonts w:ascii="Arial" w:hAnsi="Arial" w:cs="Arial"/>
+        </w:rPr>
+        <w:t>2.2.4 TAG de última versión (fuentes)</w:t>
       </w:r>
     </w:p>
     <w:p>
+      <w:pPr>
+        <w:pStyle w:val="Prrafodelista"/>
+        <w:numPr>
+          <w:ilvl w:val="0"/>
+          <w:numId w:val="900"/>
+        </w:numPr>
+        <w:rPr/>
+      </w:pPr>
+      <w:r>
+        <w:rPr>
+          <w:rFonts w:ascii="Arial" w:hAnsi="Arial" w:eastAsia="Arial" w:cs="Arial"/>
+          <w:sz w:val="20"/>
+          <w:szCs w:val="20"/>
+        </w:rPr>
+        <w:t>p.1.1.0 (mantenimiento)</w:t>
+      </w:r>
+    </w:p>
+    <w:p>
+      <w:pPr>
+        <w:pStyle w:val="Prrafodelista"/>
+        <w:numPr>
+          <w:ilvl w:val="0"/>
+          <w:numId w:val="900"/>
+        </w:numPr>
+        <w:rPr/>
+      </w:pPr>
+      <w:r>
+        <w:rPr>
+          <w:rFonts w:ascii="Arial" w:hAnsi="Arial" w:eastAsia="Arial" w:cs="Arial"/>
+          <w:sz w:val="20"/>
+          <w:szCs w:val="20"/>
+        </w:rPr>
+        <w:t xml:space="preserve">Versión anterior en producción: </w:t>
+      </w:r>
+      <w:r>
+        <w:rPr>
+          <w:rFonts w:ascii="Arial" w:hAnsi="Arial" w:eastAsia="Arial" w:cs="Arial"/>
+          <w:sz w:val="20"/>
+          <w:szCs w:val="20"/>
+        </w:rPr>
+        <w:t>p.1.0.0</w:t>
+      </w:r>
+    </w:p>
+    <w:p>
+      <w:pPr>
+        <w:spacing w:after="60"/>
+        <w:rPr>
+          <w:rFonts w:ascii="Arial" w:hAnsi="Arial" w:cs="Arial"/>
+          <w:sz w:val="20"/>
+          <w:szCs w:val="20"/>
+        </w:rPr>
+      </w:pPr>
+    </w:p>
+    <w:p>
+      <w:pPr>
+        <w:spacing w:after="60"/>
+        <w:rPr>
+          <w:rFonts w:ascii="Arial" w:hAnsi="Arial" w:cs="Arial"/>
+          <w:sz w:val="20"/>
+          <w:szCs w:val="20"/>
+        </w:rPr>
+      </w:pPr>
+    </w:p>
+    <w:p>
+      <w:pPr>
+        <w:spacing w:after="60"/>
+        <w:rPr>
+          <w:rFonts w:ascii="Arial" w:hAnsi="Arial" w:cs="Arial"/>
+          <w:sz w:val="20"/>
+          <w:szCs w:val="20"/>
+        </w:rPr>
+      </w:pPr>
+    </w:p>
+    <w:p xmlns:wp14="http://schemas.microsoft.com/office/word/2010/wordml" wp14:textId="77777777">
+      <w:pPr>
+        <w:pStyle w:val="Ttulo1"/>
+        <w:rPr>
+          <w:rFonts w:cs="Arial"/>
+          <w:sz w:val="24"/>
+          <w:szCs w:val="24"/>
+        </w:rPr>
+      </w:pPr>
+      <w:r>
+        <w:rPr>
+          <w:rFonts w:cs="Arial"/>
+          <w:sz w:val="24"/>
+          <w:szCs w:val="24"/>
+        </w:rPr>
+        <w:t xml:space="preserve">Pre-requisitos de instalación </w:t>
+      </w:r>
+    </w:p>
+    <w:p xmlns:wp14="http://schemas.microsoft.com/office/word/2010/wordml" wp14:textId="77777777">
+      <w:pPr>
+        <w:rPr>
+          <w:rFonts w:ascii="Arial" w:hAnsi="Arial" w:cs="Arial"/>
+          <w:color w:val="8496B0" w:themeColor="text2" w:themeTint="99"/>
+          <w:sz w:val="18"/>
+          <w:szCs w:val="18"/>
+        </w:rPr>
+      </w:pPr>
+      <w:r>
+        <w:rPr>
+          <w:rFonts w:ascii="Arial" w:hAnsi="Arial" w:cs="Arial"/>
+          <w:color w:val="8496B0" w:themeColor="text2" w:themeTint="99"/>
+          <w:sz w:val="18"/>
+          <w:szCs w:val="18"/>
+        </w:rPr>
+        <w:t>Lista de condiciones que deben cumplirse antes de instalar: versiones mínimas, accesos/credenciales, backups realizados, espacio/capacidad, aprobaciones y chequeos de salud de servicios.</w:t>
+      </w:r>
+    </w:p>
+    <w:p xmlns:wp14="http://schemas.microsoft.com/office/word/2010/wordml" wp14:textId="77777777">
+      <w:pPr>
+        <w:spacing w:after="120"/>
+        <w:rPr>
+          <w:rFonts w:ascii="Arial" w:hAnsi="Arial" w:cs="Arial"/>
+          <w:sz w:val="20"/>
+          <w:szCs w:val="20"/>
+        </w:rPr>
+      </w:pPr>
+      <w:r>
+        <w:rPr>
+          <w:rFonts w:ascii="Arial" w:hAnsi="Arial" w:cs="Arial"/>
+          <w:sz w:val="20"/>
+          <w:szCs w:val="20"/>
+        </w:rPr>
+        <w:t xml:space="preserve">Sin cambios respecto del despliegue anterior: el pipeline, las Cluster Tasks y las imágenes ya están en el cluster productivo.</w:t>
+      </w:r>
+    </w:p>
+    <w:p xmlns:wp14="http://schemas.microsoft.com/office/word/2010/wordml" wp14:textId="77777777">
+      <w:pPr>
+        <w:spacing w:after="60"/>
+        <w:rPr>
+          <w:rFonts w:ascii="Arial" w:hAnsi="Arial" w:cs="Arial"/>
+          <w:sz w:val="20"/>
+          <w:szCs w:val="20"/>
+        </w:rPr>
+      </w:pPr>
+      <w:r>
+        <w:rPr>
+          <w:rFonts w:ascii="Arial" w:hAnsi="Arial" w:cs="Arial"/>
+          <w:b/>
+          <w:sz w:val="20"/>
+          <w:szCs w:val="20"/>
+        </w:rPr>
+        <w:t xml:space="preserve">Openshift:</w:t>
+      </w:r>
+    </w:p>
+    <w:p xmlns:wp14="http://schemas.microsoft.com/office/word/2010/wordml" wp14:textId="77777777">
+      <w:pPr>
+        <w:spacing w:after="120"/>
+        <w:rPr>
+          <w:rFonts w:ascii="Arial" w:hAnsi="Arial" w:cs="Arial"/>
+          <w:sz w:val="20"/>
+          <w:szCs w:val="20"/>
+        </w:rPr>
+      </w:pPr>
+      <w:r>
+        <w:rPr>
+          <w:rFonts w:ascii="Arial" w:hAnsi="Arial" w:cs="Arial"/>
+          <w:sz w:val="20"/>
+          <w:szCs w:val="20"/>
+        </w:rPr>
+        <w:t xml:space="preserve">El pipeline utiliza Cluster Tasks, con el template previamente definido con Webmaster. Por lo tanto es necesario que las Cluster Task que se están utilizando en dev/test se encuentren en el cluster Productivo. Tasks:</w:t>
+      </w:r>
+    </w:p>
+    <w:p xmlns:wp14="http://schemas.microsoft.com/office/word/2010/wordml" wp14:textId="77777777">
       <w:pPr>
         <w:numPr>
           <w:ilvl w:val="0"/>
@@ -2712,32 +2925,10 @@
           <w:sz w:val="20"/>
           <w:szCs w:val="20"/>
         </w:rPr>
-        <w:t xml:space="preserve">Ajustes de carátula, montos e indicadores financieros (TIR, tasa de corte, VAN)</w:t>
-      </w:r>
-    </w:p>
-    <w:p xmlns:wp14="http://schemas.microsoft.com/office/word/2010/wordml" wp14:textId="77777777">
-      <w:pPr>
-        <w:ind w:left="426"/>
-        <w:rPr>
-          <w:rFonts w:ascii="Arial" w:hAnsi="Arial" w:cs="Arial"/>
-        </w:rPr>
-      </w:pPr>
-    </w:p>
-    <w:p xmlns:wp14="http://schemas.microsoft.com/office/word/2010/wordml" wp14:textId="77777777">
-      <w:pPr>
-        <w:ind w:left="426"/>
-        <w:rPr>
-          <w:rFonts w:ascii="Arial" w:hAnsi="Arial" w:cs="Arial"/>
-        </w:rPr>
-      </w:pPr>
-      <w:r>
-        <w:rPr>
-          <w:rFonts w:ascii="Arial" w:hAnsi="Arial" w:cs="Arial"/>
-        </w:rPr>
-        <w:t>2.2.3 Problemas conocidos</w:t>
-      </w:r>
-    </w:p>
-    <w:p>
+        <w:t xml:space="preserve">git-clone-correo</w:t>
+      </w:r>
+    </w:p>
+    <w:p xmlns:wp14="http://schemas.microsoft.com/office/word/2010/wordml" wp14:textId="77777777">
       <w:pPr>
         <w:numPr>
           <w:ilvl w:val="0"/>
@@ -2756,32 +2947,10 @@
           <w:sz w:val="20"/>
           <w:szCs w:val="20"/>
         </w:rPr>
-        <w:t xml:space="preserve">S/R</w:t>
-      </w:r>
-    </w:p>
-    <w:p xmlns:wp14="http://schemas.microsoft.com/office/word/2010/wordml" wp14:textId="77777777">
-      <w:pPr>
-        <w:ind w:left="426"/>
-        <w:rPr>
-          <w:rFonts w:ascii="Arial" w:hAnsi="Arial" w:cs="Arial"/>
-        </w:rPr>
-      </w:pPr>
-    </w:p>
-    <w:p xmlns:wp14="http://schemas.microsoft.com/office/word/2010/wordml" wp14:textId="77777777">
-      <w:pPr>
-        <w:ind w:left="426"/>
-        <w:rPr>
-          <w:rFonts w:ascii="Arial" w:hAnsi="Arial" w:cs="Arial"/>
-        </w:rPr>
-      </w:pPr>
-      <w:r>
-        <w:rPr>
-          <w:rFonts w:ascii="Arial" w:hAnsi="Arial" w:cs="Arial"/>
-        </w:rPr>
-        <w:t>2.2.4 TAG de última versión (fuentes)</w:t>
-      </w:r>
-    </w:p>
-    <w:p>
+        <w:t xml:space="preserve">buildah-correo</w:t>
+      </w:r>
+    </w:p>
+    <w:p xmlns:wp14="http://schemas.microsoft.com/office/word/2010/wordml" wp14:textId="77777777">
       <w:pPr>
         <w:numPr>
           <w:ilvl w:val="0"/>
@@ -2800,10 +2969,10 @@
           <w:sz w:val="20"/>
           <w:szCs w:val="20"/>
         </w:rPr>
-        <w:t xml:space="preserve">p.1.10 – Versión de la aplicación v1.01.3 (mantenimiento)</w:t>
-      </w:r>
-    </w:p>
-    <w:p>
+        <w:t xml:space="preserve">apply-manifests-and-restart-correo</w:t>
+      </w:r>
+    </w:p>
+    <w:p xmlns:wp14="http://schemas.microsoft.com/office/word/2010/wordml" wp14:textId="77777777">
       <w:pPr>
         <w:numPr>
           <w:ilvl w:val="0"/>
@@ -2822,55 +2991,10 @@
           <w:sz w:val="20"/>
           <w:szCs w:val="20"/>
         </w:rPr>
-        <w:t xml:space="preserve">Versión anterior en producción: P_1.0.0</w:t>
-      </w:r>
-    </w:p>
-    <w:p xmlns:wp14="http://schemas.microsoft.com/office/word/2010/wordml" wp14:textId="77777777">
-      <w:pPr>
-        <w:ind w:left="426"/>
-        <w:rPr>
-          <w:rFonts w:ascii="Arial" w:hAnsi="Arial" w:cs="Arial"/>
-        </w:rPr>
-      </w:pPr>
-    </w:p>
-    <w:p xmlns:wp14="http://schemas.microsoft.com/office/word/2010/wordml" wp14:textId="77777777">
-      <w:pPr>
-        <w:pStyle w:val="Ttulo1"/>
-        <w:rPr>
-          <w:rFonts w:cs="Arial"/>
-          <w:sz w:val="24"/>
-          <w:szCs w:val="24"/>
-        </w:rPr>
-      </w:pPr>
-      <w:r>
-        <w:rPr>
-          <w:rFonts w:cs="Arial"/>
-          <w:sz w:val="24"/>
-          <w:szCs w:val="24"/>
-        </w:rPr>
-        <w:t xml:space="preserve">Pre-requisitos de instalación </w:t>
-      </w:r>
-    </w:p>
-    <w:p xmlns:wp14="http://schemas.microsoft.com/office/word/2010/wordml" wp14:textId="77777777">
-      <w:pPr>
-        <w:rPr>
-          <w:rFonts w:ascii="Arial" w:hAnsi="Arial" w:cs="Arial"/>
-          <w:color w:val="8496B0" w:themeColor="text2" w:themeTint="99"/>
-          <w:sz w:val="18"/>
-          <w:szCs w:val="18"/>
-        </w:rPr>
-      </w:pPr>
-      <w:r>
-        <w:rPr>
-          <w:rFonts w:ascii="Arial" w:hAnsi="Arial" w:cs="Arial"/>
-          <w:color w:val="8496B0" w:themeColor="text2" w:themeTint="99"/>
-          <w:sz w:val="18"/>
-          <w:szCs w:val="18"/>
-        </w:rPr>
-        <w:t>Lista de condiciones que deben cumplirse antes de instalar: versiones mínimas, accesos/credenciales, backups realizados, espacio/capacidad, aprobaciones y chequeos de salud de servicios.</w:t>
-      </w:r>
-    </w:p>
-    <w:p>
+        <w:t xml:space="preserve">sendmail-pipelines-correo-new</w:t>
+      </w:r>
+    </w:p>
+    <w:p xmlns:wp14="http://schemas.microsoft.com/office/word/2010/wordml" wp14:textId="77777777">
       <w:pPr>
         <w:spacing w:after="120"/>
         <w:rPr>
@@ -2885,47 +3009,10 @@
           <w:sz w:val="20"/>
           <w:szCs w:val="20"/>
         </w:rPr>
-        <w:t xml:space="preserve">Sin cambios respecto del despliegue anterior: el pipeline, las Cluster Tasks y las imágenes ya están en el cluster productivo.</w:t>
-      </w:r>
-    </w:p>
-    <w:p>
-      <w:pPr>
-        <w:spacing w:after="60"/>
-        <w:rPr>
-          <w:rFonts w:ascii="Arial" w:hAnsi="Arial" w:cs="Arial"/>
-          <w:sz w:val="20"/>
-          <w:szCs w:val="20"/>
-        </w:rPr>
-      </w:pPr>
-      <w:r>
-        <w:rPr>
-          <w:rFonts w:ascii="Arial" w:hAnsi="Arial" w:cs="Arial"/>
-          <w:b/>
-          <w:sz w:val="20"/>
-          <w:szCs w:val="20"/>
-        </w:rPr>
-        <w:t xml:space="preserve">Openshift:</w:t>
-      </w:r>
-    </w:p>
-    <w:p>
-      <w:pPr>
-        <w:spacing w:after="120"/>
-        <w:rPr>
-          <w:rFonts w:ascii="Arial" w:hAnsi="Arial" w:cs="Arial"/>
-          <w:sz w:val="20"/>
-          <w:szCs w:val="20"/>
-        </w:rPr>
-      </w:pPr>
-      <w:r>
-        <w:rPr>
-          <w:rFonts w:ascii="Arial" w:hAnsi="Arial" w:cs="Arial"/>
-          <w:sz w:val="20"/>
-          <w:szCs w:val="20"/>
-        </w:rPr>
-        <w:t xml:space="preserve">El pipeline utiliza Cluster Tasks, con el template previamente definido con Webmaster. Por lo tanto es necesario que las Cluster Task que se están utilizando en dev/test se encuentren en el cluster Productivo. Tasks:</w:t>
-      </w:r>
-    </w:p>
-    <w:p>
+        <w:t xml:space="preserve">La aplicación usa las siguientes imágenes desde el repo interno de Openshift, las mismas deben estar en el cluster Productivo:</w:t>
+      </w:r>
+    </w:p>
+    <w:p xmlns:wp14="http://schemas.microsoft.com/office/word/2010/wordml" wp14:textId="77777777">
       <w:pPr>
         <w:numPr>
           <w:ilvl w:val="0"/>
@@ -2944,10 +3031,10 @@
           <w:sz w:val="20"/>
           <w:szCs w:val="20"/>
         </w:rPr>
-        <w:t xml:space="preserve">git-clone-correo</w:t>
-      </w:r>
-    </w:p>
-    <w:p>
+        <w:t xml:space="preserve">image-registry.openshift-image-registry.svc:5000/openshift/node:24-alpine</w:t>
+      </w:r>
+    </w:p>
+    <w:p xmlns:wp14="http://schemas.microsoft.com/office/word/2010/wordml" wp14:textId="77777777">
       <w:pPr>
         <w:numPr>
           <w:ilvl w:val="0"/>
@@ -2966,10 +3053,29 @@
           <w:sz w:val="20"/>
           <w:szCs w:val="20"/>
         </w:rPr>
-        <w:t xml:space="preserve">buildah-correo</w:t>
-      </w:r>
-    </w:p>
-    <w:p>
+        <w:t xml:space="preserve">image-registry.openshift-image-registry.svc:5000/openshift/nginx:latest</w:t>
+      </w:r>
+    </w:p>
+    <w:p xmlns:wp14="http://schemas.microsoft.com/office/word/2010/wordml" wp14:textId="77777777">
+      <w:pPr>
+        <w:spacing w:after="60"/>
+        <w:rPr>
+          <w:rFonts w:ascii="Arial" w:hAnsi="Arial" w:cs="Arial"/>
+          <w:sz w:val="20"/>
+          <w:szCs w:val="20"/>
+        </w:rPr>
+      </w:pPr>
+      <w:r>
+        <w:rPr>
+          <w:rFonts w:ascii="Arial" w:hAnsi="Arial" w:cs="Arial"/>
+          <w:b/>
+          <w:sz w:val="20"/>
+          <w:szCs w:val="20"/>
+        </w:rPr>
+        <w:t xml:space="preserve">Requisitos de la aplicación:</w:t>
+      </w:r>
+    </w:p>
+    <w:p xmlns:wp14="http://schemas.microsoft.com/office/word/2010/wordml" wp14:textId="77777777">
       <w:pPr>
         <w:numPr>
           <w:ilvl w:val="0"/>
@@ -2988,10 +3094,10 @@
           <w:sz w:val="20"/>
           <w:szCs w:val="20"/>
         </w:rPr>
-        <w:t xml:space="preserve">apply-manifests-and-restart-correo</w:t>
-      </w:r>
-    </w:p>
-    <w:p>
+        <w:t xml:space="preserve">Acceso al repositorio interno donde se aloja el código</w:t>
+      </w:r>
+    </w:p>
+    <w:p xmlns:wp14="http://schemas.microsoft.com/office/word/2010/wordml" wp14:textId="77777777">
       <w:pPr>
         <w:numPr>
           <w:ilvl w:val="0"/>
@@ -3010,28 +3116,10 @@
           <w:sz w:val="20"/>
           <w:szCs w:val="20"/>
         </w:rPr>
-        <w:t xml:space="preserve">sendmail-pipelines-correo-new</w:t>
-      </w:r>
-    </w:p>
-    <w:p>
-      <w:pPr>
-        <w:spacing w:after="120"/>
-        <w:rPr>
-          <w:rFonts w:ascii="Arial" w:hAnsi="Arial" w:cs="Arial"/>
-          <w:sz w:val="20"/>
-          <w:szCs w:val="20"/>
-        </w:rPr>
-      </w:pPr>
-      <w:r>
-        <w:rPr>
-          <w:rFonts w:ascii="Arial" w:hAnsi="Arial" w:cs="Arial"/>
-          <w:sz w:val="20"/>
-          <w:szCs w:val="20"/>
-        </w:rPr>
-        <w:t xml:space="preserve">La aplicación usa las siguientes imágenes desde el repo interno de Openshift, las mismas deben estar en el cluster Productivo:</w:t>
-      </w:r>
-    </w:p>
-    <w:p>
+        <w:t xml:space="preserve">Permisos para publicar archivos estáticos en el entorno interno</w:t>
+      </w:r>
+    </w:p>
+    <w:p xmlns:wp14="http://schemas.microsoft.com/office/word/2010/wordml" wp14:textId="77777777">
       <w:pPr>
         <w:numPr>
           <w:ilvl w:val="0"/>
@@ -3050,10 +3138,10 @@
           <w:sz w:val="20"/>
           <w:szCs w:val="20"/>
         </w:rPr>
-        <w:t xml:space="preserve">image-registry.openshift-image-registry.svc:5000/openshift/node:24-alpine</w:t>
-      </w:r>
-    </w:p>
-    <w:p>
+        <w:t xml:space="preserve">Navegador web actualizado en los equipos de los usuarios (Chrome / Edge)</w:t>
+      </w:r>
+    </w:p>
+    <w:p xmlns:wp14="http://schemas.microsoft.com/office/word/2010/wordml" wp14:textId="77777777">
       <w:pPr>
         <w:numPr>
           <w:ilvl w:val="0"/>
@@ -3072,117 +3160,10 @@
           <w:sz w:val="20"/>
           <w:szCs w:val="20"/>
         </w:rPr>
-        <w:t xml:space="preserve">image-registry.openshift-image-registry.svc:5000/openshift/nginx:latest</w:t>
-      </w:r>
-    </w:p>
-    <w:p>
-      <w:pPr>
-        <w:spacing w:after="60"/>
-        <w:rPr>
-          <w:rFonts w:ascii="Arial" w:hAnsi="Arial" w:cs="Arial"/>
-          <w:sz w:val="20"/>
-          <w:szCs w:val="20"/>
-        </w:rPr>
-      </w:pPr>
-      <w:r>
-        <w:rPr>
-          <w:rFonts w:ascii="Arial" w:hAnsi="Arial" w:cs="Arial"/>
-          <w:b/>
-          <w:sz w:val="20"/>
-          <w:szCs w:val="20"/>
-        </w:rPr>
-        <w:t xml:space="preserve">Requisitos de la aplicación:</w:t>
-      </w:r>
-    </w:p>
-    <w:p>
-      <w:pPr>
-        <w:numPr>
-          <w:ilvl w:val="0"/>
-          <w:numId w:val="900"/>
-        </w:numPr>
-        <w:spacing w:after="60"/>
-        <w:rPr>
-          <w:rFonts w:ascii="Arial" w:hAnsi="Arial" w:cs="Arial"/>
-          <w:sz w:val="20"/>
-          <w:szCs w:val="20"/>
-        </w:rPr>
-      </w:pPr>
-      <w:r>
-        <w:rPr>
-          <w:rFonts w:ascii="Arial" w:hAnsi="Arial" w:cs="Arial"/>
-          <w:sz w:val="20"/>
-          <w:szCs w:val="20"/>
-        </w:rPr>
-        <w:t xml:space="preserve">Acceso al repositorio interno donde se aloja el código</w:t>
-      </w:r>
-    </w:p>
-    <w:p>
-      <w:pPr>
-        <w:numPr>
-          <w:ilvl w:val="0"/>
-          <w:numId w:val="900"/>
-        </w:numPr>
-        <w:spacing w:after="60"/>
-        <w:rPr>
-          <w:rFonts w:ascii="Arial" w:hAnsi="Arial" w:cs="Arial"/>
-          <w:sz w:val="20"/>
-          <w:szCs w:val="20"/>
-        </w:rPr>
-      </w:pPr>
-      <w:r>
-        <w:rPr>
-          <w:rFonts w:ascii="Arial" w:hAnsi="Arial" w:cs="Arial"/>
-          <w:sz w:val="20"/>
-          <w:szCs w:val="20"/>
-        </w:rPr>
-        <w:t xml:space="preserve">Permisos para publicar archivos estáticos en el entorno interno</w:t>
-      </w:r>
-    </w:p>
-    <w:p>
-      <w:pPr>
-        <w:numPr>
-          <w:ilvl w:val="0"/>
-          <w:numId w:val="900"/>
-        </w:numPr>
-        <w:spacing w:after="60"/>
-        <w:rPr>
-          <w:rFonts w:ascii="Arial" w:hAnsi="Arial" w:cs="Arial"/>
-          <w:sz w:val="20"/>
-          <w:szCs w:val="20"/>
-        </w:rPr>
-      </w:pPr>
-      <w:r>
-        <w:rPr>
-          <w:rFonts w:ascii="Arial" w:hAnsi="Arial" w:cs="Arial"/>
-          <w:sz w:val="20"/>
-          <w:szCs w:val="20"/>
-        </w:rPr>
-        <w:t xml:space="preserve">Navegador web actualizado en los equipos de los usuarios (Chrome / Edge)</w:t>
-      </w:r>
-    </w:p>
-    <w:p>
-      <w:pPr>
-        <w:numPr>
-          <w:ilvl w:val="0"/>
-          <w:numId w:val="900"/>
-        </w:numPr>
-        <w:spacing w:after="60"/>
-        <w:rPr>
-          <w:rFonts w:ascii="Arial" w:hAnsi="Arial" w:cs="Arial"/>
-          <w:sz w:val="20"/>
-          <w:szCs w:val="20"/>
-        </w:rPr>
-      </w:pPr>
-      <w:r>
-        <w:rPr>
-          <w:rFonts w:ascii="Arial" w:hAnsi="Arial" w:cs="Arial"/>
-          <w:sz w:val="20"/>
-          <w:szCs w:val="20"/>
-        </w:rPr>
         <w:t xml:space="preserve">Outlook como cliente de correo predeterminado, para abrir el borrador generado por “Enviar formulario”</w:t>
       </w:r>
     </w:p>
-    <w:p>
+    <w:p xmlns:wp14="http://schemas.microsoft.com/office/word/2010/wordml" wp14:textId="77777777">
       <w:pPr>
         <w:numPr>
           <w:ilvl w:val="0"/>
@@ -3363,6 +3344,7 @@
           <w:tcPr>
             <w:tcW w:w="2605" w:type="dxa"/>
             <w:shd w:val="clear" w:color="auto" w:fill="D9E2F3" w:themeFill="accent1" w:themeFillTint="33"/>
+            <w:tcMar/>
             <w:vAlign w:val="center"/>
           </w:tcPr>
           <w:p wp14:textId="77777777">
@@ -3384,6 +3366,7 @@
           <w:tcPr>
             <w:tcW w:w="2605" w:type="dxa"/>
             <w:shd w:val="clear" w:color="auto" w:fill="D9E2F3" w:themeFill="accent1" w:themeFillTint="33"/>
+            <w:tcMar/>
             <w:vAlign w:val="center"/>
           </w:tcPr>
           <w:p wp14:textId="77777777">
@@ -3405,6 +3388,7 @@
           <w:tcPr>
             <w:tcW w:w="2605" w:type="dxa"/>
             <w:shd w:val="clear" w:color="auto" w:fill="D9E2F3" w:themeFill="accent1" w:themeFillTint="33"/>
+            <w:tcMar/>
             <w:vAlign w:val="center"/>
           </w:tcPr>
           <w:p wp14:textId="77777777">
@@ -3426,6 +3410,7 @@
           <w:tcPr>
             <w:tcW w:w="2606" w:type="dxa"/>
             <w:shd w:val="clear" w:color="auto" w:fill="D9E2F3" w:themeFill="accent1" w:themeFillTint="33"/>
+            <w:tcMar/>
             <w:vAlign w:val="center"/>
           </w:tcPr>
           <w:p wp14:textId="77777777">
@@ -3451,8 +3436,9 @@
         <w:tc>
           <w:tcPr>
             <w:tcW w:w="2605" w:type="dxa"/>
+            <w:tcMar/>
           </w:tcPr>
-          <w:p>
+          <w:p xmlns:wp14="http://schemas.microsoft.com/office/word/2010/wordml" wp14:textId="77777777">
             <w:pPr>
               <w:spacing w:before="40" w:after="40"/>
               <w:rPr>
@@ -3474,8 +3460,9 @@
         <w:tc>
           <w:tcPr>
             <w:tcW w:w="2605" w:type="dxa"/>
+            <w:tcMar/>
           </w:tcPr>
-          <w:p>
+          <w:p xmlns:wp14="http://schemas.microsoft.com/office/word/2010/wordml" wp14:textId="77777777">
             <w:pPr>
               <w:spacing w:before="40" w:after="40"/>
               <w:rPr>
@@ -3497,8 +3484,9 @@
         <w:tc>
           <w:tcPr>
             <w:tcW w:w="2605" w:type="dxa"/>
+            <w:tcMar/>
           </w:tcPr>
-          <w:p>
+          <w:p xmlns:wp14="http://schemas.microsoft.com/office/word/2010/wordml" wp14:textId="77777777">
             <w:pPr>
               <w:spacing w:before="40" w:after="40"/>
               <w:rPr>
@@ -3520,23 +3508,19 @@
         <w:tc>
           <w:tcPr>
             <w:tcW w:w="2606" w:type="dxa"/>
+            <w:tcMar/>
           </w:tcPr>
           <w:p>
             <w:pPr>
-              <w:spacing w:before="40" w:after="40"/>
-              <w:rPr>
-                <w:rFonts w:ascii="Arial" w:hAnsi="Arial" w:cs="Arial"/>
-                <w:sz w:val="20"/>
-                <w:szCs w:val="20"/>
-              </w:rPr>
+              <w:pStyle w:val="Normal"/>
             </w:pPr>
             <w:r>
               <w:rPr>
-                <w:rFonts w:ascii="Arial" w:hAnsi="Arial" w:cs="Arial"/>
-                <w:sz w:val="20"/>
-                <w:szCs w:val="20"/>
-              </w:rPr>
-              <w:t xml:space="preserve">p.1.10</w:t>
+                <w:rFonts w:ascii="Arial" w:hAnsi="Arial" w:eastAsia="Arial" w:cs="Arial"/>
+                <w:sz w:val="20"/>
+                <w:szCs w:val="20"/>
+              </w:rPr>
+              <w:t>p.1.1.0</w:t>
             </w:r>
           </w:p>
         </w:tc>
@@ -3569,7 +3553,7 @@
       </w:r>
       <w:bookmarkEnd w:id="1"/>
     </w:p>
-    <w:p>
+    <w:p xmlns:wp14="http://schemas.microsoft.com/office/word/2010/wordml" wp14:textId="77777777">
       <w:pPr>
         <w:numPr>
           <w:ilvl w:val="0"/>
@@ -3666,7 +3650,7 @@
         <w:t>4.2.1         Ambientes de instalación</w:t>
       </w:r>
     </w:p>
-    <w:p>
+    <w:p xmlns:wp14="http://schemas.microsoft.com/office/word/2010/wordml" wp14:textId="77777777">
       <w:pPr>
         <w:spacing w:after="60"/>
         <w:ind w:left="426"/>
@@ -3685,7 +3669,7 @@
         <w:t xml:space="preserve">Namespaces:</w:t>
       </w:r>
     </w:p>
-    <w:p>
+    <w:p xmlns:wp14="http://schemas.microsoft.com/office/word/2010/wordml" wp14:textId="77777777">
       <w:pPr>
         <w:numPr>
           <w:ilvl w:val="0"/>
@@ -3707,7 +3691,7 @@
         <w:t xml:space="preserve">Dev: apem-dev</w:t>
       </w:r>
     </w:p>
-    <w:p>
+    <w:p xmlns:wp14="http://schemas.microsoft.com/office/word/2010/wordml" wp14:textId="77777777">
       <w:pPr>
         <w:numPr>
           <w:ilvl w:val="0"/>
@@ -3729,7 +3713,7 @@
         <w:t xml:space="preserve">Test: apem-test</w:t>
       </w:r>
     </w:p>
-    <w:p>
+    <w:p xmlns:wp14="http://schemas.microsoft.com/office/word/2010/wordml" wp14:textId="77777777">
       <w:pPr>
         <w:numPr>
           <w:ilvl w:val="0"/>
@@ -3776,7 +3760,7 @@
         <w:t>4.2.2        Pasos - Webmaster</w:t>
       </w:r>
     </w:p>
-    <w:p>
+    <w:p xmlns:wp14="http://schemas.microsoft.com/office/word/2010/wordml" wp14:textId="77777777">
       <w:pPr>
         <w:numPr>
           <w:ilvl w:val="0"/>
@@ -3798,7 +3782,7 @@
         <w:t xml:space="preserve">Repositorio: http://gitlab.correo.local/apem/apemformularios</w:t>
       </w:r>
     </w:p>
-    <w:p>
+    <w:p xmlns:wp14="http://schemas.microsoft.com/office/word/2010/wordml" wp14:textId="77777777">
       <w:pPr>
         <w:numPr>
           <w:ilvl w:val="0"/>
@@ -3817,10 +3801,112 @@
           <w:sz w:val="20"/>
           <w:szCs w:val="20"/>
         </w:rPr>
-        <w:t xml:space="preserve">Namespace: apem</w:t>
+        <w:t>Namespace: apem</w:t>
       </w:r>
     </w:p>
     <w:p>
+      <w:pPr>
+        <w:pStyle w:val="Prrafodelista"/>
+        <w:numPr>
+          <w:ilvl w:val="0"/>
+          <w:numId w:val="900"/>
+        </w:numPr>
+        <w:rPr/>
+      </w:pPr>
+      <w:r>
+        <w:rPr>
+          <w:rFonts w:ascii="Arial" w:hAnsi="Arial" w:eastAsia="Arial" w:cs="Arial"/>
+          <w:sz w:val="20"/>
+          <w:szCs w:val="20"/>
+        </w:rPr>
+        <w:t>Tag: p.1.1.0</w:t>
+      </w:r>
+    </w:p>
+    <w:p xmlns:wp14="http://schemas.microsoft.com/office/word/2010/wordml" wp14:textId="77777777">
+      <w:pPr>
+        <w:spacing w:after="60"/>
+        <w:ind w:left="426"/>
+        <w:rPr>
+          <w:rFonts w:ascii="Arial" w:hAnsi="Arial" w:cs="Arial"/>
+          <w:sz w:val="20"/>
+          <w:szCs w:val="20"/>
+        </w:rPr>
+      </w:pPr>
+      <w:r>
+        <w:rPr>
+          <w:rFonts w:ascii="Arial" w:hAnsi="Arial" w:cs="Arial"/>
+          <w:sz w:val="20"/>
+          <w:szCs w:val="20"/>
+        </w:rPr>
+        <w:t xml:space="preserve">Pasos:</w:t>
+      </w:r>
+    </w:p>
+    <w:p xmlns:wp14="http://schemas.microsoft.com/office/word/2010/wordml" wp14:textId="77777777">
+      <w:pPr>
+        <w:numPr>
+          <w:ilvl w:val="0"/>
+          <w:numId w:val="901"/>
+        </w:numPr>
+        <w:spacing w:after="60"/>
+        <w:rPr>
+          <w:rFonts w:ascii="Arial" w:hAnsi="Arial" w:cs="Arial"/>
+          <w:sz w:val="20"/>
+          <w:szCs w:val="20"/>
+        </w:rPr>
+      </w:pPr>
+      <w:r>
+        <w:rPr>
+          <w:rFonts w:ascii="Arial" w:hAnsi="Arial" w:cs="Arial"/>
+          <w:sz w:val="20"/>
+          <w:szCs w:val="20"/>
+        </w:rPr>
+        <w:t>Verificar que el pipeline apemformularios-pipeline exista en Openshift (creado en el despliegue anterior desde openshift/production/base/pipeline.yaml). Si no existe, crearlo desde ese archivo.</w:t>
+      </w:r>
+    </w:p>
+    <w:p>
+      <w:pPr>
+        <w:pStyle w:val="Prrafodelista"/>
+        <w:numPr>
+          <w:ilvl w:val="0"/>
+          <w:numId w:val="901"/>
+        </w:numPr>
+        <w:rPr/>
+      </w:pPr>
+      <w:r>
+        <w:rPr>
+          <w:rFonts w:ascii="Arial" w:hAnsi="Arial" w:eastAsia="Arial" w:cs="Arial"/>
+          <w:sz w:val="20"/>
+          <w:szCs w:val="20"/>
+        </w:rPr>
+        <w:t>Ejecutar el pipeline apemformularios-pipeline con el tag p.1.1.0.</w:t>
+      </w:r>
+    </w:p>
+    <w:p xmlns:wp14="http://schemas.microsoft.com/office/word/2010/wordml" wp14:textId="77777777">
+      <w:pPr>
+        <w:ind w:left="426"/>
+        <w:rPr>
+          <w:rFonts w:ascii="Arial" w:hAnsi="Arial" w:cs="Arial"/>
+          <w:lang w:eastAsia="es-ES"/>
+        </w:rPr>
+      </w:pPr>
+    </w:p>
+    <w:p xmlns:wp14="http://schemas.microsoft.com/office/word/2010/wordml" wp14:textId="77777777">
+      <w:pPr>
+        <w:ind w:left="426"/>
+        <w:rPr>
+          <w:rFonts w:ascii="Arial" w:hAnsi="Arial" w:cs="Arial"/>
+          <w:lang w:eastAsia="es-ES"/>
+        </w:rPr>
+      </w:pPr>
+      <w:r>
+        <w:rPr>
+          <w:rFonts w:ascii="Arial" w:hAnsi="Arial" w:cs="Arial"/>
+          <w:lang w:eastAsia="es-ES"/>
+        </w:rPr>
+        <w:t>4.2.3        Pasos – DBA Oracle</w:t>
+      </w:r>
+    </w:p>
+    <w:p xmlns:wp14="http://schemas.microsoft.com/office/word/2010/wordml" wp14:textId="77777777">
       <w:pPr>
         <w:numPr>
           <w:ilvl w:val="0"/>
@@ -3839,98 +3925,26 @@
           <w:sz w:val="20"/>
           <w:szCs w:val="20"/>
         </w:rPr>
-        <w:t xml:space="preserve">Tag: p.1.10</w:t>
-      </w:r>
-    </w:p>
-    <w:p>
-      <w:pPr>
-        <w:spacing w:after="60"/>
+        <w:t xml:space="preserve">N/A</w:t>
+      </w:r>
+    </w:p>
+    <w:p xmlns:wp14="http://schemas.microsoft.com/office/word/2010/wordml" wp14:textId="77777777">
+      <w:pPr>
         <w:ind w:left="426"/>
         <w:rPr>
           <w:rFonts w:ascii="Arial" w:hAnsi="Arial" w:cs="Arial"/>
-          <w:sz w:val="20"/>
-          <w:szCs w:val="20"/>
-        </w:rPr>
-      </w:pPr>
-      <w:r>
-        <w:rPr>
-          <w:rFonts w:ascii="Arial" w:hAnsi="Arial" w:cs="Arial"/>
-          <w:sz w:val="20"/>
-          <w:szCs w:val="20"/>
-        </w:rPr>
-        <w:t xml:space="preserve">Pasos:</w:t>
-      </w:r>
-    </w:p>
-    <w:p>
-      <w:pPr>
-        <w:numPr>
-          <w:ilvl w:val="0"/>
-          <w:numId w:val="901"/>
-        </w:numPr>
-        <w:spacing w:after="60"/>
-        <w:rPr>
-          <w:rFonts w:ascii="Arial" w:hAnsi="Arial" w:cs="Arial"/>
-          <w:sz w:val="20"/>
-          <w:szCs w:val="20"/>
-        </w:rPr>
-      </w:pPr>
-      <w:r>
-        <w:rPr>
-          <w:rFonts w:ascii="Arial" w:hAnsi="Arial" w:cs="Arial"/>
-          <w:sz w:val="20"/>
-          <w:szCs w:val="20"/>
-        </w:rPr>
-        <w:t xml:space="preserve">Verificar que el pipeline apemformularios-pipeline exista en Openshift (creado en el despliegue anterior desde openshift/production/base/pipeline.yaml). Si no existe, crearlo desde ese archivo.</w:t>
-      </w:r>
-    </w:p>
-    <w:p>
-      <w:pPr>
-        <w:numPr>
-          <w:ilvl w:val="0"/>
-          <w:numId w:val="901"/>
-        </w:numPr>
-        <w:spacing w:after="60"/>
-        <w:rPr>
-          <w:rFonts w:ascii="Arial" w:hAnsi="Arial" w:cs="Arial"/>
-          <w:sz w:val="20"/>
-          <w:szCs w:val="20"/>
-        </w:rPr>
-      </w:pPr>
-      <w:r>
-        <w:rPr>
-          <w:rFonts w:ascii="Arial" w:hAnsi="Arial" w:cs="Arial"/>
-          <w:sz w:val="20"/>
-          <w:szCs w:val="20"/>
-        </w:rPr>
-        <w:t xml:space="preserve">Ejecutar el pipeline apemformularios-pipeline con el tag p.1.10.</w:t>
-      </w:r>
-    </w:p>
-    <w:p xmlns:wp14="http://schemas.microsoft.com/office/word/2010/wordml" wp14:textId="77777777">
-      <w:pPr>
-        <w:ind w:left="426"/>
-        <w:rPr>
-          <w:rFonts w:ascii="Arial" w:hAnsi="Arial" w:cs="Arial"/>
           <w:lang w:eastAsia="es-ES"/>
         </w:rPr>
       </w:pPr>
-    </w:p>
-    <w:p xmlns:wp14="http://schemas.microsoft.com/office/word/2010/wordml" wp14:textId="77777777">
-      <w:pPr>
-        <w:ind w:left="426"/>
+      <w:r>
         <w:rPr>
           <w:rFonts w:ascii="Arial" w:hAnsi="Arial" w:cs="Arial"/>
           <w:lang w:eastAsia="es-ES"/>
         </w:rPr>
-      </w:pPr>
-      <w:r>
-        <w:rPr>
-          <w:rFonts w:ascii="Arial" w:hAnsi="Arial" w:cs="Arial"/>
-          <w:lang w:eastAsia="es-ES"/>
-        </w:rPr>
-        <w:t>4.2.3        Pasos – DBA Oracle</w:t>
-      </w:r>
-    </w:p>
-    <w:p>
+        <w:t>4.2.4        Pasos – DBA SQL</w:t>
+      </w:r>
+    </w:p>
+    <w:p xmlns:wp14="http://schemas.microsoft.com/office/word/2010/wordml" wp14:textId="77777777">
       <w:pPr>
         <w:numPr>
           <w:ilvl w:val="0"/>
@@ -3965,10 +3979,10 @@
           <w:rFonts w:ascii="Arial" w:hAnsi="Arial" w:cs="Arial"/>
           <w:lang w:eastAsia="es-ES"/>
         </w:rPr>
-        <w:t>4.2.4        Pasos – DBA SQL</w:t>
-      </w:r>
-    </w:p>
-    <w:p>
+        <w:t>4.2.5       Migración de datos</w:t>
+      </w:r>
+    </w:p>
+    <w:p xmlns:wp14="http://schemas.microsoft.com/office/word/2010/wordml" wp14:textId="77777777">
       <w:pPr>
         <w:numPr>
           <w:ilvl w:val="0"/>
@@ -3987,7 +4001,7 @@
           <w:sz w:val="20"/>
           <w:szCs w:val="20"/>
         </w:rPr>
-        <w:t xml:space="preserve">N/A</w:t>
+        <w:t xml:space="preserve">N/A en servidor. En cada navegador, el borrador de la versión anterior se importa automáticamente al nuevo catálogo de APEM al abrir la aplicación.</w:t>
       </w:r>
     </w:p>
     <w:p xmlns:wp14="http://schemas.microsoft.com/office/word/2010/wordml" wp14:textId="77777777">
@@ -4003,10 +4017,66 @@
           <w:rFonts w:ascii="Arial" w:hAnsi="Arial" w:cs="Arial"/>
           <w:lang w:eastAsia="es-ES"/>
         </w:rPr>
-        <w:t>4.2.5       Migración de datos</w:t>
+        <w:t>4.2.6       Verificación de la implementación</w:t>
+      </w:r>
+    </w:p>
+    <w:p xmlns:wp14="http://schemas.microsoft.com/office/word/2010/wordml" wp14:textId="77777777">
+      <w:pPr>
+        <w:spacing w:after="120"/>
+        <w:ind w:left="426"/>
+        <w:rPr>
+          <w:rFonts w:ascii="Arial" w:hAnsi="Arial" w:cs="Arial"/>
+          <w:sz w:val="20"/>
+          <w:szCs w:val="20"/>
+        </w:rPr>
+      </w:pPr>
+      <w:r>
+        <w:rPr>
+          <w:rFonts w:ascii="Arial" w:hAnsi="Arial" w:cs="Arial"/>
+          <w:sz w:val="20"/>
+          <w:szCs w:val="20"/>
+        </w:rPr>
+        <w:t xml:space="preserve">Verificar que el pod “apemformularios” se encuentre deployado correctamente.</w:t>
+      </w:r>
+    </w:p>
+    <w:p xmlns:wp14="http://schemas.microsoft.com/office/word/2010/wordml" wp14:textId="77777777">
+      <w:pPr>
+        <w:spacing w:after="60"/>
+        <w:ind w:left="426"/>
+        <w:rPr>
+          <w:rFonts w:ascii="Arial" w:hAnsi="Arial" w:cs="Arial"/>
+          <w:sz w:val="20"/>
+          <w:szCs w:val="20"/>
+        </w:rPr>
+      </w:pPr>
+      <w:r>
+        <w:rPr>
+          <w:rFonts w:ascii="Arial" w:hAnsi="Arial" w:cs="Arial"/>
+          <w:sz w:val="20"/>
+          <w:szCs w:val="20"/>
+        </w:rPr>
+        <w:t>Pruebas Funcionales:</w:t>
       </w:r>
     </w:p>
     <w:p>
+      <w:pPr>
+        <w:pStyle w:val="Prrafodelista"/>
+        <w:numPr>
+          <w:ilvl w:val="0"/>
+          <w:numId w:val="900"/>
+        </w:numPr>
+        <w:rPr/>
+      </w:pPr>
+      <w:r>
+        <w:rPr>
+          <w:rFonts w:ascii="Arial" w:hAnsi="Arial" w:eastAsia="Arial" w:cs="Arial"/>
+          <w:sz w:val="20"/>
+          <w:szCs w:val="20"/>
+        </w:rPr>
+        <w:t>Acceso correcto a la aplicación y versión p.1.1.0 visible en el pie de página</w:t>
+      </w:r>
+    </w:p>
+    <w:p xmlns:wp14="http://schemas.microsoft.com/office/word/2010/wordml" wp14:textId="77777777">
       <w:pPr>
         <w:numPr>
           <w:ilvl w:val="0"/>
@@ -4025,64 +4095,10 @@
           <w:sz w:val="20"/>
           <w:szCs w:val="20"/>
         </w:rPr>
-        <w:t xml:space="preserve">N/A en servidor. En cada navegador, el borrador de la versión anterior se importa automáticamente al nuevo catálogo de APEM al abrir la aplicación.</w:t>
-      </w:r>
-    </w:p>
-    <w:p xmlns:wp14="http://schemas.microsoft.com/office/word/2010/wordml" wp14:textId="77777777">
-      <w:pPr>
-        <w:ind w:left="426"/>
-        <w:rPr>
-          <w:rFonts w:ascii="Arial" w:hAnsi="Arial" w:cs="Arial"/>
-          <w:lang w:eastAsia="es-ES"/>
-        </w:rPr>
-      </w:pPr>
-      <w:r>
-        <w:rPr>
-          <w:rFonts w:ascii="Arial" w:hAnsi="Arial" w:cs="Arial"/>
-          <w:lang w:eastAsia="es-ES"/>
-        </w:rPr>
-        <w:t>4.2.6       Verificación de la implementación</w:t>
-      </w:r>
-    </w:p>
-    <w:p>
-      <w:pPr>
-        <w:spacing w:after="120"/>
-        <w:ind w:left="426"/>
-        <w:rPr>
-          <w:rFonts w:ascii="Arial" w:hAnsi="Arial" w:cs="Arial"/>
-          <w:sz w:val="20"/>
-          <w:szCs w:val="20"/>
-        </w:rPr>
-      </w:pPr>
-      <w:r>
-        <w:rPr>
-          <w:rFonts w:ascii="Arial" w:hAnsi="Arial" w:cs="Arial"/>
-          <w:sz w:val="20"/>
-          <w:szCs w:val="20"/>
-        </w:rPr>
-        <w:t xml:space="preserve">Verificar que el pod “apemformularios” se encuentre deployado correctamente.</w:t>
-      </w:r>
-    </w:p>
-    <w:p>
-      <w:pPr>
-        <w:spacing w:after="60"/>
-        <w:ind w:left="426"/>
-        <w:rPr>
-          <w:rFonts w:ascii="Arial" w:hAnsi="Arial" w:cs="Arial"/>
-          <w:sz w:val="20"/>
-          <w:szCs w:val="20"/>
-        </w:rPr>
-      </w:pPr>
-      <w:r>
-        <w:rPr>
-          <w:rFonts w:ascii="Arial" w:hAnsi="Arial" w:cs="Arial"/>
-          <w:sz w:val="20"/>
-          <w:szCs w:val="20"/>
-        </w:rPr>
-        <w:t xml:space="preserve">Pruebas Funcionales:</w:t>
-      </w:r>
-    </w:p>
-    <w:p>
+        <w:t xml:space="preserve">Un borrador existente de la versión anterior aparece en el menú APEM</w:t>
+      </w:r>
+    </w:p>
+    <w:p xmlns:wp14="http://schemas.microsoft.com/office/word/2010/wordml" wp14:textId="77777777">
       <w:pPr>
         <w:numPr>
           <w:ilvl w:val="0"/>
@@ -4101,10 +4117,10 @@
           <w:sz w:val="20"/>
           <w:szCs w:val="20"/>
         </w:rPr>
-        <w:t xml:space="preserve">Acceso correcto a la aplicación y versión v1.01.3 visible en el pie de página</w:t>
-      </w:r>
-    </w:p>
-    <w:p>
+        <w:t xml:space="preserve">Crear un segundo APEM, alternar entre ambos y confirmar que los datos se conservan</w:t>
+      </w:r>
+    </w:p>
+    <w:p xmlns:wp14="http://schemas.microsoft.com/office/word/2010/wordml" wp14:textId="77777777">
       <w:pPr>
         <w:numPr>
           <w:ilvl w:val="0"/>
@@ -4123,10 +4139,10 @@
           <w:sz w:val="20"/>
           <w:szCs w:val="20"/>
         </w:rPr>
-        <w:t xml:space="preserve">Un borrador existente de la versión anterior aparece en el menú APEM</w:t>
-      </w:r>
-    </w:p>
-    <w:p>
+        <w:t xml:space="preserve">Validación de carga de datos y de los campos obligatorios de la carátula</w:t>
+      </w:r>
+    </w:p>
+    <w:p xmlns:wp14="http://schemas.microsoft.com/office/word/2010/wordml" wp14:textId="77777777">
       <w:pPr>
         <w:numPr>
           <w:ilvl w:val="0"/>
@@ -4145,10 +4161,10 @@
           <w:sz w:val="20"/>
           <w:szCs w:val="20"/>
         </w:rPr>
-        <w:t xml:space="preserve">Crear un segundo APEM, alternar entre ambos y confirmar que los datos se conservan</w:t>
-      </w:r>
-    </w:p>
-    <w:p>
+        <w:t xml:space="preserve">Correcta generación del PDF: código AD-OO-0136/01, montos redondeados, TIR / tasa de corte / VAN con decimales, Observaciones en el resumen ejecutivo</w:t>
+      </w:r>
+    </w:p>
+    <w:p xmlns:wp14="http://schemas.microsoft.com/office/word/2010/wordml" wp14:textId="77777777">
       <w:pPr>
         <w:numPr>
           <w:ilvl w:val="0"/>
@@ -4167,10 +4183,10 @@
           <w:sz w:val="20"/>
           <w:szCs w:val="20"/>
         </w:rPr>
-        <w:t xml:space="preserve">Validación de carga de datos y de los campos obligatorios de la carátula</w:t>
-      </w:r>
-    </w:p>
-    <w:p>
+        <w:t xml:space="preserve">“Enviar formulario” descarga el .eml; Outlook lo abre con el PDF adjunto y los destinatarios de APEM</w:t>
+      </w:r>
+    </w:p>
+    <w:p xmlns:wp14="http://schemas.microsoft.com/office/word/2010/wordml" wp14:textId="77777777">
       <w:pPr>
         <w:numPr>
           <w:ilvl w:val="0"/>
@@ -4189,50 +4205,6 @@
           <w:sz w:val="20"/>
           <w:szCs w:val="20"/>
         </w:rPr>
-        <w:t xml:space="preserve">Correcta generación del PDF: código AD-OO-0136/01, montos redondeados, TIR / tasa de corte / VAN con decimales, Observaciones en el resumen ejecutivo</w:t>
-      </w:r>
-    </w:p>
-    <w:p>
-      <w:pPr>
-        <w:numPr>
-          <w:ilvl w:val="0"/>
-          <w:numId w:val="900"/>
-        </w:numPr>
-        <w:spacing w:after="60"/>
-        <w:rPr>
-          <w:rFonts w:ascii="Arial" w:hAnsi="Arial" w:cs="Arial"/>
-          <w:sz w:val="20"/>
-          <w:szCs w:val="20"/>
-        </w:rPr>
-      </w:pPr>
-      <w:r>
-        <w:rPr>
-          <w:rFonts w:ascii="Arial" w:hAnsi="Arial" w:cs="Arial"/>
-          <w:sz w:val="20"/>
-          <w:szCs w:val="20"/>
-        </w:rPr>
-        <w:t xml:space="preserve">“Enviar formulario” descarga el .eml; Outlook lo abre con el PDF adjunto y los destinatarios de APEM</w:t>
-      </w:r>
-    </w:p>
-    <w:p>
-      <w:pPr>
-        <w:numPr>
-          <w:ilvl w:val="0"/>
-          <w:numId w:val="900"/>
-        </w:numPr>
-        <w:spacing w:after="60"/>
-        <w:rPr>
-          <w:rFonts w:ascii="Arial" w:hAnsi="Arial" w:cs="Arial"/>
-          <w:sz w:val="20"/>
-          <w:szCs w:val="20"/>
-        </w:rPr>
-      </w:pPr>
-      <w:r>
-        <w:rPr>
-          <w:rFonts w:ascii="Arial" w:hAnsi="Arial" w:cs="Arial"/>
-          <w:sz w:val="20"/>
-          <w:szCs w:val="20"/>
-        </w:rPr>
         <w:t xml:space="preserve">Prueba funcional básica con usuarios referentes</w:t>
       </w:r>
     </w:p>
@@ -4274,7 +4246,7 @@
       <w:r>
         <w:rPr>
           <w:rFonts w:ascii="Arial" w:hAnsi="Arial" w:cs="Arial"/>
-          <w:color w:val="8496B0" w:themeColor="text2" w:themeTint="99"/>
+          <w:color w:val="8496B0" w:themeColor="text2" w:themeTint="99" w:themeShade="FF"/>
           <w:sz w:val="18"/>
           <w:szCs w:val="18"/>
         </w:rPr>
@@ -4283,7 +4255,7 @@
       <w:r>
         <w:rPr>
           <w:rFonts w:ascii="Cambria Math" w:hAnsi="Cambria Math" w:cs="Cambria Math"/>
-          <w:color w:val="8496B0" w:themeColor="text2" w:themeTint="99"/>
+          <w:color w:val="8496B0" w:themeColor="text2" w:themeTint="99" w:themeShade="FF"/>
           <w:sz w:val="18"/>
           <w:szCs w:val="18"/>
         </w:rPr>
@@ -4292,7 +4264,7 @@
       <w:r>
         <w:rPr>
           <w:rFonts w:ascii="Arial" w:hAnsi="Arial" w:cs="Arial"/>
-          <w:color w:val="8496B0" w:themeColor="text2" w:themeTint="99"/>
+          <w:color w:val="8496B0" w:themeColor="text2" w:themeTint="99" w:themeShade="FF"/>
           <w:sz w:val="18"/>
           <w:szCs w:val="18"/>
         </w:rPr>
@@ -4301,47 +4273,118 @@
     </w:p>
     <w:p>
       <w:pPr>
-        <w:spacing w:after="120"/>
-        <w:rPr>
-          <w:rFonts w:ascii="Arial" w:hAnsi="Arial" w:cs="Arial"/>
-          <w:sz w:val="20"/>
-          <w:szCs w:val="20"/>
-        </w:rPr>
-      </w:pPr>
-      <w:r>
-        <w:rPr>
-          <w:rFonts w:ascii="Arial" w:hAnsi="Arial" w:cs="Arial"/>
-          <w:sz w:val="20"/>
-          <w:szCs w:val="20"/>
-        </w:rPr>
-        <w:t xml:space="preserve">Estrategia: rollback a la revisión anterior del Deployment (P_1.0.0).</w:t>
+        <w:pStyle w:val="Normal"/>
+      </w:pPr>
+      <w:r>
+        <w:rPr>
+          <w:rFonts w:ascii="Arial" w:hAnsi="Arial" w:eastAsia="Arial" w:cs="Arial"/>
+          <w:sz w:val="20"/>
+          <w:szCs w:val="20"/>
+        </w:rPr>
+        <w:t>Estrategia: rollback a la revisión anterior del Deployment (p.1.0.0).</w:t>
       </w:r>
     </w:p>
     <w:p>
       <w:pPr>
-        <w:spacing w:after="120"/>
-        <w:rPr>
-          <w:rFonts w:ascii="Arial" w:hAnsi="Arial" w:cs="Arial"/>
-          <w:sz w:val="20"/>
-          <w:szCs w:val="20"/>
-        </w:rPr>
-      </w:pPr>
-      <w:r>
-        <w:rPr>
-          <w:rFonts w:ascii="Arial" w:hAnsi="Arial" w:cs="Arial"/>
-          <w:b/>
-          <w:sz w:val="20"/>
-          <w:szCs w:val="20"/>
-        </w:rPr>
-        <w:t xml:space="preserve">Limitación:</w:t>
-      </w:r>
-      <w:r>
-        <w:rPr>
-          <w:rFonts w:ascii="Arial" w:hAnsi="Arial" w:cs="Arial"/>
-          <w:sz w:val="20"/>
-          <w:szCs w:val="20"/>
-        </w:rPr>
-        <w:t xml:space="preserve"> al abrir p.1.10, el borrador del navegador se mueve al nuevo catálogo de APEM. Si se vuelve a P_1.0.0, esa versión no ve los APEM guardados con p.1.10; los datos siguen en el navegador y reaparecen al reinstalar p.1.10. Mitigación: exportar a PDF los formularios en curso antes de ejecutar el rollback.</w:t>
+        <w:pStyle w:val="Normal"/>
+      </w:pPr>
+      <w:r>
+        <w:rPr>
+          <w:rFonts w:ascii="Arial" w:hAnsi="Arial" w:eastAsia="Arial" w:cs="Arial"/>
+          <w:b w:val="1"/>
+          <w:bCs w:val="1"/>
+          <w:sz w:val="20"/>
+          <w:szCs w:val="20"/>
+        </w:rPr>
+        <w:t>Limitación:</w:t>
+      </w:r>
+      <w:r>
+        <w:rPr>
+          <w:rFonts w:ascii="Arial" w:hAnsi="Arial" w:eastAsia="Arial" w:cs="Arial"/>
+          <w:sz w:val="20"/>
+          <w:szCs w:val="20"/>
+        </w:rPr>
+        <w:t xml:space="preserve"> al abrir</w:t>
+      </w:r>
+      <w:r>
+        <w:rPr>
+          <w:rFonts w:ascii="Arial" w:hAnsi="Arial" w:eastAsia="Arial" w:cs="Arial"/>
+          <w:sz w:val="20"/>
+          <w:szCs w:val="20"/>
+        </w:rPr>
+        <w:t xml:space="preserve"> p.1.1.0</w:t>
+      </w:r>
+      <w:r>
+        <w:rPr>
+          <w:rFonts w:ascii="Arial" w:hAnsi="Arial" w:eastAsia="Arial" w:cs="Arial"/>
+          <w:sz w:val="20"/>
+          <w:szCs w:val="20"/>
+        </w:rPr>
+        <w:t xml:space="preserve">, el borrador del navegador se mueve al nuevo catálogo de APEM. Si se vuelve a </w:t>
+      </w:r>
+      <w:r>
+        <w:rPr>
+          <w:rFonts w:ascii="Arial" w:hAnsi="Arial" w:eastAsia="Arial" w:cs="Arial"/>
+          <w:sz w:val="20"/>
+          <w:szCs w:val="20"/>
+        </w:rPr>
+        <w:t>p.1.0.0</w:t>
+      </w:r>
+      <w:r>
+        <w:rPr>
+          <w:rFonts w:ascii="Arial" w:hAnsi="Arial" w:eastAsia="Arial" w:cs="Arial"/>
+          <w:sz w:val="20"/>
+          <w:szCs w:val="20"/>
+        </w:rPr>
+        <w:t>, esa versión no ve los APEM guardados con</w:t>
+      </w:r>
+      <w:r>
+        <w:rPr>
+          <w:rFonts w:ascii="Arial" w:hAnsi="Arial" w:eastAsia="Arial" w:cs="Arial"/>
+          <w:sz w:val="20"/>
+          <w:szCs w:val="20"/>
+        </w:rPr>
+        <w:t xml:space="preserve"> p.1.1.0</w:t>
+      </w:r>
+      <w:r>
+        <w:rPr>
+          <w:rFonts w:ascii="Arial" w:hAnsi="Arial" w:eastAsia="Arial" w:cs="Arial"/>
+          <w:sz w:val="20"/>
+          <w:szCs w:val="20"/>
+        </w:rPr>
+        <w:t xml:space="preserve">; los datos siguen en el navegador y reaparecen al reinstalar </w:t>
+      </w:r>
+      <w:r>
+        <w:rPr>
+          <w:rFonts w:ascii="Arial" w:hAnsi="Arial" w:eastAsia="Arial" w:cs="Arial"/>
+          <w:sz w:val="20"/>
+          <w:szCs w:val="20"/>
+        </w:rPr>
+        <w:t>p.1.1.0</w:t>
+      </w:r>
+      <w:r>
+        <w:rPr>
+          <w:rFonts w:ascii="Arial" w:hAnsi="Arial" w:eastAsia="Arial" w:cs="Arial"/>
+          <w:sz w:val="20"/>
+          <w:szCs w:val="20"/>
+        </w:rPr>
+        <w:t xml:space="preserve"> Mitigación: exportar a PDF los formularios en curso antes de ejecutar el </w:t>
+      </w:r>
+      <w:r>
+        <w:rPr>
+          <w:rFonts w:ascii="Arial" w:hAnsi="Arial" w:eastAsia="Arial" w:cs="Arial"/>
+          <w:sz w:val="20"/>
+          <w:szCs w:val="20"/>
+        </w:rPr>
+        <w:t>rollback</w:t>
+      </w:r>
+      <w:r>
+        <w:rPr>
+          <w:rFonts w:ascii="Arial" w:hAnsi="Arial" w:eastAsia="Arial" w:cs="Arial"/>
+          <w:sz w:val="20"/>
+          <w:szCs w:val="20"/>
+        </w:rPr>
+        <w:t>.</w:t>
       </w:r>
     </w:p>
     <w:p xmlns:wp14="http://schemas.microsoft.com/office/word/2010/wordml" wp14:textId="77777777">
@@ -4386,7 +4429,7 @@
         <w:t>Condiciones que disparan el rollback (errores críticos, KPIs fuera de rango, fallas en smoke tests, tiempo excedido) y responsable de quién decide ejecutarlo.</w:t>
       </w:r>
     </w:p>
-    <w:p>
+    <w:p xmlns:wp14="http://schemas.microsoft.com/office/word/2010/wordml" wp14:textId="77777777">
       <w:pPr>
         <w:spacing w:after="120"/>
         <w:rPr>
@@ -4427,7 +4470,7 @@
         <w:gridCol w:w="4400"/>
         <w:gridCol w:w="3600"/>
       </w:tblGrid>
-      <w:tr>
+      <w:tr xmlns:wp14="http://schemas.microsoft.com/office/word/2010/wordml" wp14:textId="77777777">
         <w:trPr>
           <w:trHeight w:val="339"/>
           <w:tblHeader/>
@@ -4438,7 +4481,7 @@
             <w:shd w:val="clear" w:color="auto" w:fill="D9E2F3"/>
             <w:vAlign w:val="center"/>
           </w:tcPr>
-          <w:p>
+          <w:p wp14:textId="77777777">
             <w:pPr>
               <w:spacing w:before="40" w:after="40"/>
               <w:jc w:val="center"/>
@@ -4465,7 +4508,7 @@
             <w:shd w:val="clear" w:color="auto" w:fill="D9E2F3"/>
             <w:vAlign w:val="center"/>
           </w:tcPr>
-          <w:p>
+          <w:p wp14:textId="77777777">
             <w:pPr>
               <w:spacing w:before="40" w:after="40"/>
               <w:jc w:val="center"/>
@@ -4492,7 +4535,7 @@
             <w:shd w:val="clear" w:color="auto" w:fill="D9E2F3"/>
             <w:vAlign w:val="center"/>
           </w:tcPr>
-          <w:p>
+          <w:p wp14:textId="77777777">
             <w:pPr>
               <w:spacing w:before="40" w:after="40"/>
               <w:jc w:val="center"/>
@@ -4514,7 +4557,7 @@
           </w:p>
         </w:tc>
       </w:tr>
-      <w:tr>
+      <w:tr xmlns:wp14="http://schemas.microsoft.com/office/word/2010/wordml" wp14:textId="77777777">
         <w:trPr>
           <w:trHeight w:val="339"/>
         </w:trPr>
@@ -4523,7 +4566,7 @@
             <w:tcW w:w="2400" w:type="dxa"/>
             <w:vAlign w:val="center"/>
           </w:tcPr>
-          <w:p>
+          <w:p wp14:textId="77777777">
             <w:pPr>
               <w:spacing w:before="40" w:after="40"/>
               <w:rPr>
@@ -4547,7 +4590,7 @@
             <w:tcW w:w="4400" w:type="dxa"/>
             <w:vAlign w:val="center"/>
           </w:tcPr>
-          <w:p>
+          <w:p wp14:textId="77777777">
             <w:pPr>
               <w:spacing w:before="40" w:after="40"/>
               <w:rPr>
@@ -4571,7 +4614,7 @@
             <w:tcW w:w="3600" w:type="dxa"/>
             <w:vAlign w:val="center"/>
           </w:tcPr>
-          <w:p>
+          <w:p wp14:textId="77777777">
             <w:pPr>
               <w:spacing w:before="40" w:after="40"/>
               <w:rPr>
@@ -4591,7 +4634,7 @@
           </w:p>
         </w:tc>
       </w:tr>
-      <w:tr>
+      <w:tr xmlns:wp14="http://schemas.microsoft.com/office/word/2010/wordml" wp14:textId="77777777">
         <w:trPr>
           <w:trHeight w:val="339"/>
         </w:trPr>
@@ -4600,7 +4643,7 @@
             <w:tcW w:w="2400" w:type="dxa"/>
             <w:vAlign w:val="center"/>
           </w:tcPr>
-          <w:p>
+          <w:p wp14:textId="77777777">
             <w:pPr>
               <w:spacing w:before="40" w:after="40"/>
               <w:rPr>
@@ -4624,7 +4667,7 @@
             <w:tcW w:w="4400" w:type="dxa"/>
             <w:vAlign w:val="center"/>
           </w:tcPr>
-          <w:p>
+          <w:p wp14:textId="77777777">
             <w:pPr>
               <w:spacing w:before="40" w:after="40"/>
               <w:rPr>
@@ -4648,7 +4691,7 @@
             <w:tcW w:w="3600" w:type="dxa"/>
             <w:vAlign w:val="center"/>
           </w:tcPr>
-          <w:p>
+          <w:p wp14:textId="77777777">
             <w:pPr>
               <w:spacing w:before="40" w:after="40"/>
               <w:rPr>
@@ -4668,7 +4711,7 @@
           </w:p>
         </w:tc>
       </w:tr>
-      <w:tr>
+      <w:tr xmlns:wp14="http://schemas.microsoft.com/office/word/2010/wordml" wp14:textId="77777777">
         <w:trPr>
           <w:trHeight w:val="339"/>
         </w:trPr>
@@ -4677,7 +4720,7 @@
             <w:tcW w:w="2400" w:type="dxa"/>
             <w:vAlign w:val="center"/>
           </w:tcPr>
-          <w:p>
+          <w:p wp14:textId="77777777">
             <w:pPr>
               <w:spacing w:before="40" w:after="40"/>
               <w:rPr>
@@ -4701,7 +4744,7 @@
             <w:tcW w:w="4400" w:type="dxa"/>
             <w:vAlign w:val="center"/>
           </w:tcPr>
-          <w:p>
+          <w:p wp14:textId="77777777">
             <w:pPr>
               <w:spacing w:before="40" w:after="40"/>
               <w:rPr>
@@ -4725,7 +4768,7 @@
             <w:tcW w:w="3600" w:type="dxa"/>
             <w:vAlign w:val="center"/>
           </w:tcPr>
-          <w:p>
+          <w:p wp14:textId="77777777">
             <w:pPr>
               <w:spacing w:before="40" w:after="40"/>
               <w:rPr>
@@ -4745,7 +4788,7 @@
           </w:p>
         </w:tc>
       </w:tr>
-      <w:tr>
+      <w:tr xmlns:wp14="http://schemas.microsoft.com/office/word/2010/wordml" wp14:textId="77777777">
         <w:trPr>
           <w:trHeight w:val="339"/>
         </w:trPr>
@@ -4754,7 +4797,7 @@
             <w:tcW w:w="2400" w:type="dxa"/>
             <w:vAlign w:val="center"/>
           </w:tcPr>
-          <w:p>
+          <w:p wp14:textId="77777777">
             <w:pPr>
               <w:spacing w:before="40" w:after="40"/>
               <w:rPr>
@@ -4778,7 +4821,7 @@
             <w:tcW w:w="4400" w:type="dxa"/>
             <w:vAlign w:val="center"/>
           </w:tcPr>
-          <w:p>
+          <w:p wp14:textId="77777777">
             <w:pPr>
               <w:spacing w:before="40" w:after="40"/>
               <w:rPr>
@@ -4802,7 +4845,7 @@
             <w:tcW w:w="3600" w:type="dxa"/>
             <w:vAlign w:val="center"/>
           </w:tcPr>
-          <w:p>
+          <w:p wp14:textId="77777777">
             <w:pPr>
               <w:spacing w:before="40" w:after="40"/>
               <w:rPr>
@@ -4822,7 +4865,7 @@
           </w:p>
         </w:tc>
       </w:tr>
-      <w:tr>
+      <w:tr xmlns:wp14="http://schemas.microsoft.com/office/word/2010/wordml" wp14:textId="77777777">
         <w:trPr>
           <w:trHeight w:val="339"/>
         </w:trPr>
@@ -4831,7 +4874,7 @@
             <w:tcW w:w="2400" w:type="dxa"/>
             <w:vAlign w:val="center"/>
           </w:tcPr>
-          <w:p>
+          <w:p wp14:textId="77777777">
             <w:pPr>
               <w:spacing w:before="40" w:after="40"/>
               <w:rPr>
@@ -4855,7 +4898,7 @@
             <w:tcW w:w="4400" w:type="dxa"/>
             <w:vAlign w:val="center"/>
           </w:tcPr>
-          <w:p>
+          <w:p wp14:textId="77777777">
             <w:pPr>
               <w:spacing w:before="40" w:after="40"/>
               <w:rPr>
@@ -4879,7 +4922,7 @@
             <w:tcW w:w="3600" w:type="dxa"/>
             <w:vAlign w:val="center"/>
           </w:tcPr>
-          <w:p>
+          <w:p wp14:textId="77777777">
             <w:pPr>
               <w:spacing w:before="40" w:after="40"/>
               <w:rPr>
@@ -4899,7 +4942,7 @@
           </w:p>
         </w:tc>
       </w:tr>
-      <w:tr>
+      <w:tr xmlns:wp14="http://schemas.microsoft.com/office/word/2010/wordml" wp14:textId="77777777">
         <w:trPr>
           <w:trHeight w:val="339"/>
         </w:trPr>
@@ -4908,7 +4951,7 @@
             <w:tcW w:w="2400" w:type="dxa"/>
             <w:vAlign w:val="center"/>
           </w:tcPr>
-          <w:p>
+          <w:p wp14:textId="77777777">
             <w:pPr>
               <w:spacing w:before="40" w:after="40"/>
               <w:rPr>
@@ -4932,7 +4975,7 @@
             <w:tcW w:w="4400" w:type="dxa"/>
             <w:vAlign w:val="center"/>
           </w:tcPr>
-          <w:p>
+          <w:p wp14:textId="77777777">
             <w:pPr>
               <w:spacing w:before="40" w:after="40"/>
               <w:rPr>
@@ -4956,7 +4999,7 @@
             <w:tcW w:w="3600" w:type="dxa"/>
             <w:vAlign w:val="center"/>
           </w:tcPr>
-          <w:p>
+          <w:p wp14:textId="77777777">
             <w:pPr>
               <w:spacing w:before="40" w:after="40"/>
               <w:rPr>
@@ -4976,7 +5019,7 @@
           </w:p>
         </w:tc>
       </w:tr>
-      <w:tr>
+      <w:tr xmlns:wp14="http://schemas.microsoft.com/office/word/2010/wordml" wp14:textId="77777777">
         <w:trPr>
           <w:trHeight w:val="339"/>
         </w:trPr>
@@ -4985,7 +5028,7 @@
             <w:tcW w:w="2400" w:type="dxa"/>
             <w:vAlign w:val="center"/>
           </w:tcPr>
-          <w:p>
+          <w:p wp14:textId="77777777">
             <w:pPr>
               <w:spacing w:before="40" w:after="40"/>
               <w:rPr>
@@ -5009,7 +5052,7 @@
             <w:tcW w:w="4400" w:type="dxa"/>
             <w:vAlign w:val="center"/>
           </w:tcPr>
-          <w:p>
+          <w:p wp14:textId="77777777">
             <w:pPr>
               <w:spacing w:before="40" w:after="40"/>
               <w:rPr>
@@ -5033,7 +5076,7 @@
             <w:tcW w:w="3600" w:type="dxa"/>
             <w:vAlign w:val="center"/>
           </w:tcPr>
-          <w:p>
+          <w:p wp14:textId="77777777">
             <w:pPr>
               <w:spacing w:before="40" w:after="40"/>
               <w:rPr>
@@ -5053,7 +5096,7 @@
           </w:p>
         </w:tc>
       </w:tr>
-      <w:tr>
+      <w:tr xmlns:wp14="http://schemas.microsoft.com/office/word/2010/wordml" wp14:textId="77777777">
         <w:trPr>
           <w:trHeight w:val="339"/>
         </w:trPr>
@@ -5062,7 +5105,7 @@
             <w:tcW w:w="2400" w:type="dxa"/>
             <w:vAlign w:val="center"/>
           </w:tcPr>
-          <w:p>
+          <w:p wp14:textId="77777777">
             <w:pPr>
               <w:spacing w:before="40" w:after="40"/>
               <w:rPr>
@@ -5086,7 +5129,7 @@
             <w:tcW w:w="4400" w:type="dxa"/>
             <w:vAlign w:val="center"/>
           </w:tcPr>
-          <w:p>
+          <w:p wp14:textId="77777777">
             <w:pPr>
               <w:spacing w:before="40" w:after="40"/>
               <w:rPr>
@@ -5110,7 +5153,7 @@
             <w:tcW w:w="3600" w:type="dxa"/>
             <w:vAlign w:val="center"/>
           </w:tcPr>
-          <w:p>
+          <w:p wp14:textId="77777777">
             <w:pPr>
               <w:spacing w:before="40" w:after="40"/>
               <w:rPr>
@@ -5130,7 +5173,7 @@
           </w:p>
         </w:tc>
       </w:tr>
-      <w:tr>
+      <w:tr xmlns:wp14="http://schemas.microsoft.com/office/word/2010/wordml" wp14:textId="77777777">
         <w:trPr>
           <w:trHeight w:val="339"/>
         </w:trPr>
@@ -5139,7 +5182,7 @@
             <w:tcW w:w="2400" w:type="dxa"/>
             <w:vAlign w:val="center"/>
           </w:tcPr>
-          <w:p>
+          <w:p wp14:textId="77777777">
             <w:pPr>
               <w:spacing w:before="40" w:after="40"/>
               <w:rPr>
@@ -5163,7 +5206,7 @@
             <w:tcW w:w="4400" w:type="dxa"/>
             <w:vAlign w:val="center"/>
           </w:tcPr>
-          <w:p>
+          <w:p wp14:textId="77777777">
             <w:pPr>
               <w:spacing w:before="40" w:after="40"/>
               <w:rPr>
@@ -5187,7 +5230,7 @@
             <w:tcW w:w="3600" w:type="dxa"/>
             <w:vAlign w:val="center"/>
           </w:tcPr>
-          <w:p>
+          <w:p wp14:textId="77777777">
             <w:pPr>
               <w:spacing w:before="40" w:after="40"/>
               <w:rPr>
@@ -5207,7 +5250,7 @@
           </w:p>
         </w:tc>
       </w:tr>
-      <w:tr>
+      <w:tr xmlns:wp14="http://schemas.microsoft.com/office/word/2010/wordml" wp14:textId="77777777">
         <w:trPr>
           <w:trHeight w:val="339"/>
         </w:trPr>
@@ -5216,7 +5259,7 @@
             <w:tcW w:w="2400" w:type="dxa"/>
             <w:vAlign w:val="center"/>
           </w:tcPr>
-          <w:p>
+          <w:p wp14:textId="77777777">
             <w:pPr>
               <w:spacing w:before="40" w:after="40"/>
               <w:rPr>
@@ -5240,7 +5283,7 @@
             <w:tcW w:w="4400" w:type="dxa"/>
             <w:vAlign w:val="center"/>
           </w:tcPr>
-          <w:p>
+          <w:p wp14:textId="77777777">
             <w:pPr>
               <w:spacing w:before="40" w:after="40"/>
               <w:rPr>
@@ -5264,7 +5307,7 @@
             <w:tcW w:w="3600" w:type="dxa"/>
             <w:vAlign w:val="center"/>
           </w:tcPr>
-          <w:p>
+          <w:p wp14:textId="77777777">
             <w:pPr>
               <w:spacing w:before="40" w:after="40"/>
               <w:rPr>
@@ -5284,7 +5327,7 @@
           </w:p>
         </w:tc>
       </w:tr>
-      <w:tr>
+      <w:tr xmlns:wp14="http://schemas.microsoft.com/office/word/2010/wordml" wp14:textId="77777777">
         <w:trPr>
           <w:trHeight w:val="339"/>
         </w:trPr>
@@ -5293,7 +5336,7 @@
             <w:tcW w:w="2400" w:type="dxa"/>
             <w:vAlign w:val="center"/>
           </w:tcPr>
-          <w:p>
+          <w:p wp14:textId="77777777">
             <w:pPr>
               <w:spacing w:before="40" w:after="40"/>
               <w:rPr>
@@ -5317,7 +5360,7 @@
             <w:tcW w:w="4400" w:type="dxa"/>
             <w:vAlign w:val="center"/>
           </w:tcPr>
-          <w:p>
+          <w:p wp14:textId="77777777">
             <w:pPr>
               <w:spacing w:before="40" w:after="40"/>
               <w:rPr>
@@ -5341,7 +5384,7 @@
             <w:tcW w:w="3600" w:type="dxa"/>
             <w:vAlign w:val="center"/>
           </w:tcPr>
-          <w:p>
+          <w:p wp14:textId="77777777">
             <w:pPr>
               <w:spacing w:before="40" w:after="40"/>
               <w:rPr>
@@ -5422,7 +5465,7 @@
         <w:t>rollback.</w:t>
       </w:r>
     </w:p>
-    <w:p>
+    <w:p xmlns:wp14="http://schemas.microsoft.com/office/word/2010/wordml" wp14:textId="77777777">
       <w:pPr>
         <w:spacing w:after="120"/>
         <w:rPr>
@@ -5449,7 +5492,7 @@
         <w:t xml:space="preserve"> restauración de bases de datos, volúmenes ni scripts de datos inversos (no hay persistencia server-side).</w:t>
       </w:r>
     </w:p>
-    <w:p>
+    <w:p xmlns:wp14="http://schemas.microsoft.com/office/word/2010/wordml" wp14:textId="77777777">
       <w:pPr>
         <w:numPr>
           <w:ilvl w:val="0"/>
@@ -5471,7 +5514,7 @@
         <w:t xml:space="preserve">Listar historial de revisiones:</w:t>
       </w:r>
     </w:p>
-    <w:p>
+    <w:p xmlns:wp14="http://schemas.microsoft.com/office/word/2010/wordml" wp14:textId="77777777">
       <w:pPr>
         <w:numPr>
           <w:ilvl w:val="1"/>
@@ -5493,7 +5536,7 @@
         <w:t xml:space="preserve">oc rollout history deployment/apemformularios -n apem</w:t>
       </w:r>
     </w:p>
-    <w:p>
+    <w:p xmlns:wp14="http://schemas.microsoft.com/office/word/2010/wordml" wp14:textId="77777777">
       <w:pPr>
         <w:numPr>
           <w:ilvl w:val="0"/>
@@ -5515,7 +5558,7 @@
         <w:t xml:space="preserve">Ejecutar rollback a la revisión anterior:</w:t>
       </w:r>
     </w:p>
-    <w:p>
+    <w:p xmlns:wp14="http://schemas.microsoft.com/office/word/2010/wordml" wp14:textId="77777777">
       <w:pPr>
         <w:numPr>
           <w:ilvl w:val="1"/>
@@ -5537,7 +5580,7 @@
         <w:t xml:space="preserve">oc rollout undo deployment/apemformularios -n apem</w:t>
       </w:r>
     </w:p>
-    <w:p>
+    <w:p xmlns:wp14="http://schemas.microsoft.com/office/word/2010/wordml" wp14:textId="77777777">
       <w:pPr>
         <w:numPr>
           <w:ilvl w:val="1"/>
@@ -5567,7 +5610,7 @@
         <w:t xml:space="preserve">oc rollout undo deployment/apemformularios --to-revision=&lt;N&gt; -n apem</w:t>
       </w:r>
     </w:p>
-    <w:p>
+    <w:p xmlns:wp14="http://schemas.microsoft.com/office/word/2010/wordml" wp14:textId="77777777">
       <w:pPr>
         <w:numPr>
           <w:ilvl w:val="0"/>
@@ -5589,7 +5632,7 @@
         <w:t xml:space="preserve">Esperar finalización:</w:t>
       </w:r>
     </w:p>
-    <w:p>
+    <w:p xmlns:wp14="http://schemas.microsoft.com/office/word/2010/wordml" wp14:textId="77777777">
       <w:pPr>
         <w:numPr>
           <w:ilvl w:val="1"/>
@@ -5654,7 +5697,7 @@
         <w:t>Insertar mails con las respectivas aprobaciones de las respectivas áreas para la implementación.</w:t>
       </w:r>
     </w:p>
-    <w:p>
+    <w:p xmlns:wp14="http://schemas.microsoft.com/office/word/2010/wordml" wp14:textId="77777777">
       <w:pPr>
         <w:numPr>
           <w:ilvl w:val="0"/>
@@ -5676,7 +5719,7 @@
         <w:t xml:space="preserve">Dirección de Planeamiento Estratégico – Dolores Ersinger</w:t>
       </w:r>
     </w:p>
-    <w:p>
+    <w:p xmlns:wp14="http://schemas.microsoft.com/office/word/2010/wordml" wp14:textId="77777777">
       <w:pPr>
         <w:numPr>
           <w:ilvl w:val="0"/>
@@ -5698,7 +5741,7 @@
         <w:t xml:space="preserve">Gerencia de IA – Silvina Muzio</w:t>
       </w:r>
     </w:p>
-    <w:p>
+    <w:p xmlns:wp14="http://schemas.microsoft.com/office/word/2010/wordml" wp14:textId="77777777">
       <w:pPr>
         <w:numPr>
           <w:ilvl w:val="0"/>
@@ -5798,6 +5841,7 @@
           <w:tcPr>
             <w:tcW w:w="1094" w:type="dxa"/>
             <w:shd w:val="clear" w:color="auto" w:fill="D9E2F3" w:themeFill="accent1" w:themeFillTint="33"/>
+            <w:tcMar/>
             <w:vAlign w:val="center"/>
           </w:tcPr>
           <w:p wp14:textId="77777777">
@@ -5819,6 +5863,7 @@
           <w:tcPr>
             <w:tcW w:w="2052" w:type="dxa"/>
             <w:shd w:val="clear" w:color="auto" w:fill="D9E2F3" w:themeFill="accent1" w:themeFillTint="33"/>
+            <w:tcMar/>
             <w:vAlign w:val="center"/>
           </w:tcPr>
           <w:p wp14:textId="77777777">
@@ -5840,6 +5885,7 @@
           <w:tcPr>
             <w:tcW w:w="1464" w:type="dxa"/>
             <w:shd w:val="clear" w:color="auto" w:fill="D9E2F3" w:themeFill="accent1" w:themeFillTint="33"/>
+            <w:tcMar/>
             <w:vAlign w:val="center"/>
           </w:tcPr>
           <w:p wp14:textId="77777777">
@@ -5861,6 +5907,7 @@
           <w:tcPr>
             <w:tcW w:w="5709" w:type="dxa"/>
             <w:shd w:val="clear" w:color="auto" w:fill="D9E2F3" w:themeFill="accent1" w:themeFillTint="33"/>
+            <w:tcMar/>
             <w:vAlign w:val="center"/>
           </w:tcPr>
           <w:p wp14:textId="77777777">
@@ -5886,9 +5933,10 @@
         <w:tc>
           <w:tcPr>
             <w:tcW w:w="1094" w:type="dxa"/>
+            <w:tcMar/>
             <w:vAlign w:val="center"/>
           </w:tcPr>
-          <w:p>
+          <w:p xmlns:wp14="http://schemas.microsoft.com/office/word/2010/wordml" wp14:textId="77777777">
             <w:pPr>
               <w:spacing w:before="40" w:after="40"/>
               <w:rPr>
@@ -5910,9 +5958,10 @@
         <w:tc>
           <w:tcPr>
             <w:tcW w:w="2052" w:type="dxa"/>
+            <w:tcMar/>
             <w:vAlign w:val="center"/>
           </w:tcPr>
-          <w:p>
+          <w:p xmlns:wp14="http://schemas.microsoft.com/office/word/2010/wordml" wp14:textId="77777777">
             <w:pPr>
               <w:spacing w:before="40" w:after="40"/>
               <w:rPr>
@@ -5934,9 +5983,10 @@
         <w:tc>
           <w:tcPr>
             <w:tcW w:w="1464" w:type="dxa"/>
+            <w:tcMar/>
             <w:vAlign w:val="center"/>
           </w:tcPr>
-          <w:p>
+          <w:p xmlns:wp14="http://schemas.microsoft.com/office/word/2010/wordml" wp14:textId="77777777">
             <w:pPr>
               <w:spacing w:before="40" w:after="40"/>
               <w:rPr>
@@ -5958,24 +6008,20 @@
         <w:tc>
           <w:tcPr>
             <w:tcW w:w="5709" w:type="dxa"/>
+            <w:tcMar/>
             <w:vAlign w:val="center"/>
           </w:tcPr>
           <w:p>
             <w:pPr>
-              <w:spacing w:before="40" w:after="40"/>
-              <w:rPr>
-                <w:rFonts w:ascii="Arial" w:hAnsi="Arial" w:cs="Arial"/>
-                <w:sz w:val="20"/>
-                <w:szCs w:val="20"/>
-              </w:rPr>
+              <w:pStyle w:val="Normal"/>
             </w:pPr>
             <w:r>
               <w:rPr>
-                <w:rFonts w:ascii="Arial" w:hAnsi="Arial" w:cs="Arial"/>
-                <w:sz w:val="20"/>
-                <w:szCs w:val="20"/>
-              </w:rPr>
-              <w:t xml:space="preserve">Versión inicial del documento – despliegue v1.01.3 (p.1.10)</w:t>
+                <w:rFonts w:ascii="Arial" w:hAnsi="Arial" w:eastAsia="Arial" w:cs="Arial"/>
+                <w:sz w:val="20"/>
+                <w:szCs w:val="20"/>
+              </w:rPr>
+              <w:t xml:space="preserve">Versión inicial del documento – despliegue p.1.1.0 </w:t>
             </w:r>
           </w:p>
         </w:tc>
@@ -8212,6 +8258,7 @@
     </w:lvl>
   </w:abstractNum>
   <w:abstractNum w:abstractNumId="900">
+    <w:nsid w:val="2239fc60"/>
     <w:multiLevelType w:val="hybridMultilevel"/>
     <w:lvl w:ilvl="0">
       <w:start w:val="1"/>
@@ -8237,8 +8284,72 @@
         <w:rFonts w:ascii="Arial" w:hAnsi="Arial"/>
       </w:rPr>
     </w:lvl>
+    <w:lvl w:ilvl="2">
+      <w:start w:val="1"/>
+      <w:numFmt w:val="decimal"/>
+      <w:lvlText w:val="%3."/>
+      <w:lvlJc w:val="left"/>
+      <w:pPr>
+        <w:ind w:left="2160" w:hanging="360"/>
+      </w:pPr>
+    </w:lvl>
+    <w:lvl w:ilvl="3">
+      <w:start w:val="1"/>
+      <w:numFmt w:val="decimal"/>
+      <w:lvlText w:val="%4."/>
+      <w:lvlJc w:val="left"/>
+      <w:pPr>
+        <w:ind w:left="2880" w:hanging="360"/>
+      </w:pPr>
+    </w:lvl>
+    <w:lvl w:ilvl="4">
+      <w:start w:val="1"/>
+      <w:numFmt w:val="decimal"/>
+      <w:lvlText w:val="%5."/>
+      <w:lvlJc w:val="left"/>
+      <w:pPr>
+        <w:ind w:left="3600" w:hanging="360"/>
+      </w:pPr>
+    </w:lvl>
+    <w:lvl w:ilvl="5">
+      <w:start w:val="1"/>
+      <w:numFmt w:val="decimal"/>
+      <w:lvlText w:val="%6."/>
+      <w:lvlJc w:val="left"/>
+      <w:pPr>
+        <w:ind w:left="4320" w:hanging="360"/>
+      </w:pPr>
+    </w:lvl>
+    <w:lvl w:ilvl="6">
+      <w:start w:val="1"/>
+      <w:numFmt w:val="decimal"/>
+      <w:lvlText w:val="%7."/>
+      <w:lvlJc w:val="left"/>
+      <w:pPr>
+        <w:ind w:left="5040" w:hanging="360"/>
+      </w:pPr>
+    </w:lvl>
+    <w:lvl w:ilvl="7">
+      <w:start w:val="1"/>
+      <w:numFmt w:val="decimal"/>
+      <w:lvlText w:val="%8."/>
+      <w:lvlJc w:val="left"/>
+      <w:pPr>
+        <w:ind w:left="5760" w:hanging="360"/>
+      </w:pPr>
+    </w:lvl>
+    <w:lvl w:ilvl="8">
+      <w:start w:val="1"/>
+      <w:numFmt w:val="decimal"/>
+      <w:lvlText w:val="%9."/>
+      <w:lvlJc w:val="left"/>
+      <w:pPr>
+        <w:ind w:left="6480" w:hanging="360"/>
+      </w:pPr>
+    </w:lvl>
   </w:abstractNum>
   <w:abstractNum w:abstractNumId="901">
+    <w:nsid w:val="2e225de5"/>
     <w:multiLevelType w:val="hybridMultilevel"/>
     <w:lvl w:ilvl="0">
       <w:start w:val="1"/>
@@ -8260,6 +8371,69 @@
       <w:rPr>
         <w:rFonts w:ascii="Arial" w:hAnsi="Arial"/>
       </w:rPr>
+    </w:lvl>
+    <w:lvl w:ilvl="2">
+      <w:start w:val="1"/>
+      <w:numFmt w:val="decimal"/>
+      <w:lvlText w:val="%3."/>
+      <w:lvlJc w:val="left"/>
+      <w:pPr>
+        <w:ind w:left="2160" w:hanging="360"/>
+      </w:pPr>
+    </w:lvl>
+    <w:lvl w:ilvl="3">
+      <w:start w:val="1"/>
+      <w:numFmt w:val="decimal"/>
+      <w:lvlText w:val="%4."/>
+      <w:lvlJc w:val="left"/>
+      <w:pPr>
+        <w:ind w:left="2880" w:hanging="360"/>
+      </w:pPr>
+    </w:lvl>
+    <w:lvl w:ilvl="4">
+      <w:start w:val="1"/>
+      <w:numFmt w:val="decimal"/>
+      <w:lvlText w:val="%5."/>
+      <w:lvlJc w:val="left"/>
+      <w:pPr>
+        <w:ind w:left="3600" w:hanging="360"/>
+      </w:pPr>
+    </w:lvl>
+    <w:lvl w:ilvl="5">
+      <w:start w:val="1"/>
+      <w:numFmt w:val="decimal"/>
+      <w:lvlText w:val="%6."/>
+      <w:lvlJc w:val="left"/>
+      <w:pPr>
+        <w:ind w:left="4320" w:hanging="360"/>
+      </w:pPr>
+    </w:lvl>
+    <w:lvl w:ilvl="6">
+      <w:start w:val="1"/>
+      <w:numFmt w:val="decimal"/>
+      <w:lvlText w:val="%7."/>
+      <w:lvlJc w:val="left"/>
+      <w:pPr>
+        <w:ind w:left="5040" w:hanging="360"/>
+      </w:pPr>
+    </w:lvl>
+    <w:lvl w:ilvl="7">
+      <w:start w:val="1"/>
+      <w:numFmt w:val="decimal"/>
+      <w:lvlText w:val="%8."/>
+      <w:lvlJc w:val="left"/>
+      <w:pPr>
+        <w:ind w:left="5760" w:hanging="360"/>
+      </w:pPr>
+    </w:lvl>
+    <w:lvl w:ilvl="8">
+      <w:start w:val="1"/>
+      <w:numFmt w:val="decimal"/>
+      <w:lvlText w:val="%9."/>
+      <w:lvlJc w:val="left"/>
+      <w:pPr>
+        <w:ind w:left="6480" w:hanging="360"/>
+      </w:pPr>
     </w:lvl>
   </w:abstractNum>
   <w:num w:numId="1">

</xml_diff>